<commit_message>
update : report and notebook
</commit_message>
<xml_diff>
--- a/Sinhala/docs/final_report_v2.docx
+++ b/Sinhala/docs/final_report_v2.docx
@@ -25,14 +25,6 @@
           <w:rFonts w:ascii="Arial" w:hAnsi="Arial" w:cs="Arial"/>
         </w:rPr>
       </w:pPr>
-      <w:r>
-        <w:rPr>
-          <w:rFonts w:ascii="Arial" w:hAnsi="Arial" w:cs="Arial"/>
-        </w:rPr>
-        <w:pict w14:anchorId="1745CC18">
-          <v:rect id="_x0000_i1205" style="width:0;height:1.5pt" o:hralign="center" o:hrstd="t" o:hr="t" fillcolor="#a0a0a0" stroked="f"/>
-        </w:pict>
-      </w:r>
     </w:p>
     <w:p>
       <w:pPr>
@@ -123,14 +115,6 @@
           <w:rFonts w:ascii="Arial" w:hAnsi="Arial" w:cs="Arial"/>
         </w:rPr>
       </w:pPr>
-      <w:r>
-        <w:rPr>
-          <w:rFonts w:ascii="Arial" w:hAnsi="Arial" w:cs="Arial"/>
-        </w:rPr>
-        <w:pict w14:anchorId="6BB3674B">
-          <v:rect id="_x0000_i1206" style="width:0;height:1.5pt" o:hralign="center" o:hrstd="t" o:hr="t" fillcolor="#a0a0a0" stroked="f"/>
-        </w:pict>
-      </w:r>
     </w:p>
     <w:p>
       <w:pPr>
@@ -353,14 +337,6 @@
           <w:rFonts w:ascii="Arial" w:hAnsi="Arial" w:cs="Arial"/>
         </w:rPr>
       </w:pPr>
-      <w:r>
-        <w:rPr>
-          <w:rFonts w:ascii="Arial" w:hAnsi="Arial" w:cs="Arial"/>
-        </w:rPr>
-        <w:pict w14:anchorId="5C8E9963">
-          <v:rect id="_x0000_i1207" style="width:0;height:1.5pt" o:hralign="center" o:hrstd="t" o:hr="t" fillcolor="#a0a0a0" stroked="f"/>
-        </w:pict>
-      </w:r>
     </w:p>
     <w:p>
       <w:pPr>
@@ -531,14 +507,229 @@
       <w:pPr>
         <w:rPr>
           <w:rFonts w:ascii="Arial" w:hAnsi="Arial" w:cs="Arial"/>
+          <w:b/>
+          <w:bCs/>
         </w:rPr>
       </w:pPr>
       <w:r>
         <w:rPr>
           <w:rFonts w:ascii="Arial" w:hAnsi="Arial" w:cs="Arial"/>
+          <w:b/>
+          <w:bCs/>
+        </w:rPr>
+        <w:t>3.1 Target-Type Annotation</w:t>
+      </w:r>
+    </w:p>
+    <w:p>
+      <w:pPr>
+        <w:rPr>
+          <w:rFonts w:ascii="Arial" w:hAnsi="Arial" w:cs="Arial"/>
+        </w:rPr>
+      </w:pPr>
+      <w:r>
+        <w:rPr>
+          <w:rFonts w:ascii="Arial" w:hAnsi="Arial" w:cs="Arial"/>
+        </w:rPr>
+        <w:t xml:space="preserve">To enhance the analytical value of the dataset, an additional column named </w:t>
+      </w:r>
+      <w:proofErr w:type="spellStart"/>
+      <w:r>
+        <w:rPr>
+          <w:rFonts w:ascii="Arial" w:hAnsi="Arial" w:cs="Arial"/>
+          <w:b/>
+          <w:bCs/>
+        </w:rPr>
+        <w:t>target_type</w:t>
+      </w:r>
+      <w:proofErr w:type="spellEnd"/>
+      <w:r>
+        <w:rPr>
+          <w:rFonts w:ascii="Arial" w:hAnsi="Arial" w:cs="Arial"/>
+        </w:rPr>
+        <w:t xml:space="preserve"> was introduced. This column categorizes offensive language based on its intended target:</w:t>
+      </w:r>
+    </w:p>
+    <w:p>
+      <w:pPr>
+        <w:numPr>
+          <w:ilvl w:val="0"/>
+          <w:numId w:val="28"/>
+        </w:numPr>
+        <w:rPr>
+          <w:rFonts w:ascii="Arial" w:hAnsi="Arial" w:cs="Arial"/>
+        </w:rPr>
+      </w:pPr>
+      <w:r>
+        <w:rPr>
+          <w:rFonts w:ascii="Arial" w:hAnsi="Arial" w:cs="Arial"/>
+          <w:b/>
+          <w:bCs/>
+        </w:rPr>
+        <w:t>IND (Individual)</w:t>
+      </w:r>
+      <w:r>
+        <w:rPr>
+          <w:rFonts w:ascii="Arial" w:hAnsi="Arial" w:cs="Arial"/>
+        </w:rPr>
+        <w:t>: Offensive language directed at a specific person</w:t>
+      </w:r>
+    </w:p>
+    <w:p>
+      <w:pPr>
+        <w:numPr>
+          <w:ilvl w:val="0"/>
+          <w:numId w:val="28"/>
+        </w:numPr>
+        <w:rPr>
+          <w:rFonts w:ascii="Arial" w:hAnsi="Arial" w:cs="Arial"/>
+        </w:rPr>
+      </w:pPr>
+      <w:r>
+        <w:rPr>
+          <w:rFonts w:ascii="Arial" w:hAnsi="Arial" w:cs="Arial"/>
+          <w:b/>
+          <w:bCs/>
+        </w:rPr>
+        <w:t>GRP (Group)</w:t>
+      </w:r>
+      <w:r>
+        <w:rPr>
+          <w:rFonts w:ascii="Arial" w:hAnsi="Arial" w:cs="Arial"/>
+        </w:rPr>
+        <w:t>: Language targeting a group defined by shared characteristics (e.g., gender, race)</w:t>
+      </w:r>
+    </w:p>
+    <w:p>
+      <w:pPr>
+        <w:numPr>
+          <w:ilvl w:val="0"/>
+          <w:numId w:val="28"/>
+        </w:numPr>
+        <w:rPr>
+          <w:rFonts w:ascii="Arial" w:hAnsi="Arial" w:cs="Arial"/>
+        </w:rPr>
+      </w:pPr>
+      <w:r>
+        <w:rPr>
+          <w:rFonts w:ascii="Arial" w:hAnsi="Arial" w:cs="Arial"/>
+          <w:b/>
+          <w:bCs/>
+        </w:rPr>
+        <w:t>UNT (Untargeted)</w:t>
+      </w:r>
+      <w:r>
+        <w:rPr>
+          <w:rFonts w:ascii="Arial" w:hAnsi="Arial" w:cs="Arial"/>
+        </w:rPr>
+        <w:t>: General offensive expressions without a specific target</w:t>
+      </w:r>
+    </w:p>
+    <w:p>
+      <w:pPr>
+        <w:numPr>
+          <w:ilvl w:val="0"/>
+          <w:numId w:val="28"/>
+        </w:numPr>
+        <w:rPr>
+          <w:rFonts w:ascii="Arial" w:hAnsi="Arial" w:cs="Arial"/>
+        </w:rPr>
+      </w:pPr>
+      <w:r>
+        <w:rPr>
+          <w:rFonts w:ascii="Arial" w:hAnsi="Arial" w:cs="Arial"/>
+          <w:b/>
+          <w:bCs/>
+        </w:rPr>
+        <w:t>OTH (Organization/Event)</w:t>
+      </w:r>
+      <w:r>
+        <w:rPr>
+          <w:rFonts w:ascii="Arial" w:hAnsi="Arial" w:cs="Arial"/>
+        </w:rPr>
+        <w:t>: Language targeting institutions, organizations, or events</w:t>
+      </w:r>
+    </w:p>
+    <w:p>
+      <w:pPr>
+        <w:rPr>
+          <w:rFonts w:ascii="Arial" w:hAnsi="Arial" w:cs="Arial"/>
+          <w:b/>
+          <w:bCs/>
+        </w:rPr>
+      </w:pPr>
+      <w:r>
+        <w:rPr>
+          <w:rFonts w:ascii="Arial" w:hAnsi="Arial" w:cs="Arial"/>
+          <w:b/>
+          <w:bCs/>
+        </w:rPr>
+        <w:t>3.2 Multi-Category Entries</w:t>
+      </w:r>
+    </w:p>
+    <w:p>
+      <w:pPr>
+        <w:rPr>
+          <w:rFonts w:ascii="Arial" w:hAnsi="Arial" w:cs="Arial"/>
+        </w:rPr>
+      </w:pPr>
+      <w:r>
+        <w:rPr>
+          <w:rFonts w:ascii="Arial" w:hAnsi="Arial" w:cs="Arial"/>
+        </w:rPr>
+        <w:lastRenderedPageBreak/>
+        <w:t>A notable characteristic of the dataset is that some entries belong to multiple categories. For example:</w:t>
+      </w:r>
+    </w:p>
+    <w:p>
+      <w:pPr>
+        <w:numPr>
+          <w:ilvl w:val="0"/>
+          <w:numId w:val="29"/>
+        </w:numPr>
+        <w:rPr>
+          <w:rFonts w:ascii="Arial" w:hAnsi="Arial" w:cs="Arial"/>
+        </w:rPr>
+      </w:pPr>
+      <w:r>
+        <w:rPr>
+          <w:rFonts w:ascii="Arial" w:hAnsi="Arial" w:cs="Arial"/>
+          <w:i/>
+          <w:iCs/>
+        </w:rPr>
+        <w:t>"Disability, Gender"</w:t>
+      </w:r>
+    </w:p>
+    <w:p>
+      <w:pPr>
+        <w:rPr>
+          <w:rFonts w:ascii="Arial" w:hAnsi="Arial" w:cs="Arial"/>
+        </w:rPr>
+      </w:pPr>
+      <w:r>
+        <w:rPr>
+          <w:rFonts w:ascii="Arial" w:hAnsi="Arial" w:cs="Arial"/>
+        </w:rPr>
+        <w:t>Such cases reflect the overlapping nature of offensive language, where a single term may simultaneously target multiple social dimensions. Handling these entries required additional preprocessing steps to ensure accurate analysis.</w:t>
+      </w:r>
+    </w:p>
+    <w:p>
+      <w:pPr>
+        <w:rPr>
+          <w:rFonts w:ascii="Arial" w:hAnsi="Arial" w:cs="Arial"/>
+        </w:rPr>
+      </w:pPr>
+    </w:p>
+    <w:p>
+      <w:pPr>
+        <w:keepNext/>
+      </w:pPr>
+      <w:r>
+        <w:rPr>
+          <w:rFonts w:ascii="Arial" w:hAnsi="Arial" w:cs="Arial"/>
+          <w:noProof/>
         </w:rPr>
         <w:drawing>
-          <wp:inline distT="0" distB="0" distL="0" distR="0" wp14:anchorId="6058819F" wp14:editId="64CB4BC5">
+          <wp:inline distT="0" distB="0" distL="0" distR="0" wp14:anchorId="5EB5D0F2" wp14:editId="71746EEA">
             <wp:extent cx="5486400" cy="1288415"/>
             <wp:effectExtent l="0" t="0" r="0" b="6985"/>
             <wp:docPr id="481762613" name="Picture 1"/>
@@ -576,39 +767,453 @@
     </w:p>
     <w:p>
       <w:pPr>
-        <w:rPr>
-          <w:rFonts w:ascii="Arial" w:hAnsi="Arial" w:cs="Arial"/>
-          <w:b/>
-          <w:bCs/>
+        <w:pStyle w:val="Caption"/>
+        <w:rPr>
+          <w:rFonts w:ascii="Arial" w:hAnsi="Arial" w:cs="Arial"/>
         </w:rPr>
       </w:pPr>
       <w:r>
-        <w:rPr>
-          <w:rFonts w:ascii="Arial" w:hAnsi="Arial" w:cs="Arial"/>
-          <w:b/>
-          <w:bCs/>
-        </w:rPr>
-        <w:t>3.1 Target-Type Annotation</w:t>
+        <w:t xml:space="preserve">Figure </w:t>
+      </w:r>
+      <w:fldSimple w:instr=" SEQ Figure \* ARABIC ">
+        <w:r>
+          <w:rPr>
+            <w:noProof/>
+          </w:rPr>
+          <w:t>1</w:t>
+        </w:r>
+      </w:fldSimple>
+    </w:p>
+    <w:p>
+      <w:pPr>
+        <w:rPr>
+          <w:rFonts w:ascii="Arial" w:hAnsi="Arial" w:cs="Arial"/>
+        </w:rPr>
+      </w:pPr>
+      <w:r>
+        <w:rPr>
+          <w:rFonts w:ascii="Arial" w:hAnsi="Arial" w:cs="Arial"/>
+        </w:rPr>
+        <w:pict w14:anchorId="659F4F97">
+          <v:rect id="_x0000_i1028" style="width:0;height:1.5pt" o:hralign="center" o:hrstd="t" o:hr="t" fillcolor="#a0a0a0" stroked="f"/>
+        </w:pict>
       </w:r>
     </w:p>
     <w:p>
       <w:pPr>
         <w:rPr>
           <w:rFonts w:ascii="Arial" w:hAnsi="Arial" w:cs="Arial"/>
+          <w:b/>
+          <w:bCs/>
         </w:rPr>
       </w:pPr>
       <w:r>
         <w:rPr>
           <w:rFonts w:ascii="Arial" w:hAnsi="Arial" w:cs="Arial"/>
-        </w:rPr>
-        <w:t xml:space="preserve">To enhance the analytical value of the dataset, an additional column named </w:t>
+          <w:b/>
+          <w:bCs/>
+        </w:rPr>
+        <w:t>4. Data Preprocessing</w:t>
+      </w:r>
+    </w:p>
+    <w:p>
+      <w:pPr>
+        <w:rPr>
+          <w:rFonts w:ascii="Arial" w:hAnsi="Arial" w:cs="Arial"/>
+        </w:rPr>
+      </w:pPr>
+      <w:r>
+        <w:rPr>
+          <w:rFonts w:ascii="Arial" w:hAnsi="Arial" w:cs="Arial"/>
+        </w:rPr>
+        <w:t>Data preprocessing is a crucial step in ensuring the quality and reliability of analysis. Several preprocessing techniques were applied to the dataset.</w:t>
+      </w:r>
+    </w:p>
+    <w:p>
+      <w:pPr>
+        <w:rPr>
+          <w:rFonts w:ascii="Arial" w:hAnsi="Arial" w:cs="Arial"/>
+          <w:b/>
+          <w:bCs/>
+        </w:rPr>
+      </w:pPr>
+      <w:r>
+        <w:rPr>
+          <w:rFonts w:ascii="Arial" w:hAnsi="Arial" w:cs="Arial"/>
+          <w:b/>
+          <w:bCs/>
+        </w:rPr>
+        <w:t>4.1 Data Cleaning</w:t>
+      </w:r>
+    </w:p>
+    <w:p>
+      <w:pPr>
+        <w:rPr>
+          <w:rFonts w:ascii="Arial" w:hAnsi="Arial" w:cs="Arial"/>
+        </w:rPr>
+      </w:pPr>
+      <w:r>
+        <w:rPr>
+          <w:rFonts w:ascii="Arial" w:hAnsi="Arial" w:cs="Arial"/>
+        </w:rPr>
+        <w:t>The dataset was cleaned to remove inconsistencies and improve readability:</w:t>
+      </w:r>
+    </w:p>
+    <w:p>
+      <w:pPr>
+        <w:numPr>
+          <w:ilvl w:val="0"/>
+          <w:numId w:val="30"/>
+        </w:numPr>
+        <w:rPr>
+          <w:rFonts w:ascii="Arial" w:hAnsi="Arial" w:cs="Arial"/>
+        </w:rPr>
+      </w:pPr>
+      <w:r>
+        <w:rPr>
+          <w:rFonts w:ascii="Arial" w:hAnsi="Arial" w:cs="Arial"/>
+        </w:rPr>
+        <w:t>Removal of unwanted characters such as brackets and extra whitespace</w:t>
+      </w:r>
+    </w:p>
+    <w:p>
+      <w:pPr>
+        <w:numPr>
+          <w:ilvl w:val="0"/>
+          <w:numId w:val="30"/>
+        </w:numPr>
+        <w:rPr>
+          <w:rFonts w:ascii="Arial" w:hAnsi="Arial" w:cs="Arial"/>
+        </w:rPr>
+      </w:pPr>
+      <w:r>
+        <w:rPr>
+          <w:rFonts w:ascii="Arial" w:hAnsi="Arial" w:cs="Arial"/>
+        </w:rPr>
+        <w:t>Standardization of text formatting</w:t>
+      </w:r>
+    </w:p>
+    <w:p>
+      <w:pPr>
+        <w:numPr>
+          <w:ilvl w:val="0"/>
+          <w:numId w:val="30"/>
+        </w:numPr>
+        <w:rPr>
+          <w:rFonts w:ascii="Arial" w:hAnsi="Arial" w:cs="Arial"/>
+        </w:rPr>
+      </w:pPr>
+      <w:r>
+        <w:rPr>
+          <w:rFonts w:ascii="Arial" w:hAnsi="Arial" w:cs="Arial"/>
+        </w:rPr>
+        <w:t>Correction of inconsistent category labels</w:t>
+      </w:r>
+    </w:p>
+    <w:p>
+      <w:pPr>
+        <w:rPr>
+          <w:rFonts w:ascii="Arial" w:hAnsi="Arial" w:cs="Arial"/>
+          <w:b/>
+          <w:bCs/>
+        </w:rPr>
+      </w:pPr>
+      <w:r>
+        <w:rPr>
+          <w:rFonts w:ascii="Arial" w:hAnsi="Arial" w:cs="Arial"/>
+          <w:b/>
+          <w:bCs/>
+        </w:rPr>
+        <w:t>4.2 Handling Multi-Label Categories</w:t>
+      </w:r>
+    </w:p>
+    <w:p>
+      <w:pPr>
+        <w:rPr>
+          <w:rFonts w:ascii="Arial" w:hAnsi="Arial" w:cs="Arial"/>
+        </w:rPr>
+      </w:pPr>
+      <w:r>
+        <w:rPr>
+          <w:rFonts w:ascii="Arial" w:hAnsi="Arial" w:cs="Arial"/>
+        </w:rPr>
+        <w:t>To properly analyze entries with multiple categories, the category column was transformed:</w:t>
+      </w:r>
+    </w:p>
+    <w:p>
+      <w:pPr>
+        <w:rPr>
+          <w:rFonts w:ascii="Arial" w:hAnsi="Arial" w:cs="Arial"/>
+        </w:rPr>
+      </w:pPr>
+      <w:proofErr w:type="spellStart"/>
+      <w:r>
+        <w:rPr>
+          <w:rFonts w:ascii="Arial" w:hAnsi="Arial" w:cs="Arial"/>
+        </w:rPr>
+        <w:t>df_off</w:t>
+      </w:r>
+      <w:proofErr w:type="spellEnd"/>
+      <w:r>
+        <w:rPr>
+          <w:rFonts w:ascii="Arial" w:hAnsi="Arial" w:cs="Arial"/>
+        </w:rPr>
+        <w:t>["</w:t>
       </w:r>
       <w:proofErr w:type="spellStart"/>
       <w:r>
         <w:rPr>
           <w:rFonts w:ascii="Arial" w:hAnsi="Arial" w:cs="Arial"/>
+        </w:rPr>
+        <w:t>category_updated</w:t>
+      </w:r>
+      <w:proofErr w:type="spellEnd"/>
+      <w:r>
+        <w:rPr>
+          <w:rFonts w:ascii="Arial" w:hAnsi="Arial" w:cs="Arial"/>
+        </w:rPr>
+        <w:t xml:space="preserve">"] = </w:t>
+      </w:r>
+      <w:proofErr w:type="spellStart"/>
+      <w:r>
+        <w:rPr>
+          <w:rFonts w:ascii="Arial" w:hAnsi="Arial" w:cs="Arial"/>
+        </w:rPr>
+        <w:t>df_off</w:t>
+      </w:r>
+      <w:proofErr w:type="spellEnd"/>
+      <w:r>
+        <w:rPr>
+          <w:rFonts w:ascii="Arial" w:hAnsi="Arial" w:cs="Arial"/>
+        </w:rPr>
+        <w:t>["category"].</w:t>
+      </w:r>
+      <w:proofErr w:type="spellStart"/>
+      <w:r>
+        <w:rPr>
+          <w:rFonts w:ascii="Arial" w:hAnsi="Arial" w:cs="Arial"/>
+        </w:rPr>
+        <w:t>str.split</w:t>
+      </w:r>
+      <w:proofErr w:type="spellEnd"/>
+      <w:r>
+        <w:rPr>
+          <w:rFonts w:ascii="Arial" w:hAnsi="Arial" w:cs="Arial"/>
+        </w:rPr>
+        <w:t>(",")</w:t>
+      </w:r>
+    </w:p>
+    <w:p>
+      <w:pPr>
+        <w:rPr>
+          <w:rFonts w:ascii="Arial" w:hAnsi="Arial" w:cs="Arial"/>
+        </w:rPr>
+      </w:pPr>
+      <w:proofErr w:type="spellStart"/>
+      <w:r>
+        <w:rPr>
+          <w:rFonts w:ascii="Arial" w:hAnsi="Arial" w:cs="Arial"/>
+        </w:rPr>
+        <w:t>df_off_exploded</w:t>
+      </w:r>
+      <w:proofErr w:type="spellEnd"/>
+      <w:r>
+        <w:rPr>
+          <w:rFonts w:ascii="Arial" w:hAnsi="Arial" w:cs="Arial"/>
+        </w:rPr>
+        <w:t xml:space="preserve"> = </w:t>
+      </w:r>
+      <w:proofErr w:type="spellStart"/>
+      <w:r>
+        <w:rPr>
+          <w:rFonts w:ascii="Arial" w:hAnsi="Arial" w:cs="Arial"/>
+        </w:rPr>
+        <w:t>df_off.explode</w:t>
+      </w:r>
+      <w:proofErr w:type="spellEnd"/>
+      <w:r>
+        <w:rPr>
+          <w:rFonts w:ascii="Arial" w:hAnsi="Arial" w:cs="Arial"/>
+        </w:rPr>
+        <w:t>("</w:t>
+      </w:r>
+      <w:proofErr w:type="spellStart"/>
+      <w:r>
+        <w:rPr>
+          <w:rFonts w:ascii="Arial" w:hAnsi="Arial" w:cs="Arial"/>
+        </w:rPr>
+        <w:t>category_updated</w:t>
+      </w:r>
+      <w:proofErr w:type="spellEnd"/>
+      <w:r>
+        <w:rPr>
+          <w:rFonts w:ascii="Arial" w:hAnsi="Arial" w:cs="Arial"/>
+        </w:rPr>
+        <w:t>")</w:t>
+      </w:r>
+    </w:p>
+    <w:p>
+      <w:pPr>
+        <w:rPr>
+          <w:rFonts w:ascii="Arial" w:hAnsi="Arial" w:cs="Arial"/>
+        </w:rPr>
+      </w:pPr>
+      <w:r>
+        <w:rPr>
+          <w:rFonts w:ascii="Arial" w:hAnsi="Arial" w:cs="Arial"/>
+        </w:rPr>
+        <w:t>This process:</w:t>
+      </w:r>
+    </w:p>
+    <w:p>
+      <w:pPr>
+        <w:numPr>
+          <w:ilvl w:val="0"/>
+          <w:numId w:val="31"/>
+        </w:numPr>
+        <w:rPr>
+          <w:rFonts w:ascii="Arial" w:hAnsi="Arial" w:cs="Arial"/>
+        </w:rPr>
+      </w:pPr>
+      <w:r>
+        <w:rPr>
+          <w:rFonts w:ascii="Arial" w:hAnsi="Arial" w:cs="Arial"/>
+        </w:rPr>
+        <w:t>Converts category strings into lists</w:t>
+      </w:r>
+    </w:p>
+    <w:p>
+      <w:pPr>
+        <w:numPr>
+          <w:ilvl w:val="0"/>
+          <w:numId w:val="31"/>
+        </w:numPr>
+        <w:rPr>
+          <w:rFonts w:ascii="Arial" w:hAnsi="Arial" w:cs="Arial"/>
+        </w:rPr>
+      </w:pPr>
+      <w:r>
+        <w:rPr>
+          <w:rFonts w:ascii="Arial" w:hAnsi="Arial" w:cs="Arial"/>
+        </w:rPr>
+        <w:lastRenderedPageBreak/>
+        <w:t>Expands each category into a separate row</w:t>
+      </w:r>
+    </w:p>
+    <w:p>
+      <w:pPr>
+        <w:numPr>
+          <w:ilvl w:val="0"/>
+          <w:numId w:val="31"/>
+        </w:numPr>
+        <w:rPr>
+          <w:rFonts w:ascii="Arial" w:hAnsi="Arial" w:cs="Arial"/>
+        </w:rPr>
+      </w:pPr>
+      <w:r>
+        <w:rPr>
+          <w:rFonts w:ascii="Arial" w:hAnsi="Arial" w:cs="Arial"/>
+        </w:rPr>
+        <w:t>Enables accurate frequency analysis of individual categories</w:t>
+      </w:r>
+    </w:p>
+    <w:p>
+      <w:pPr>
+        <w:rPr>
+          <w:rFonts w:ascii="Arial" w:hAnsi="Arial" w:cs="Arial"/>
           <w:b/>
           <w:bCs/>
+        </w:rPr>
+      </w:pPr>
+      <w:r>
+        <w:rPr>
+          <w:rFonts w:ascii="Arial" w:hAnsi="Arial" w:cs="Arial"/>
+          <w:b/>
+          <w:bCs/>
+        </w:rPr>
+        <w:t>4.3 Encoding and Font Handling</w:t>
+      </w:r>
+    </w:p>
+    <w:p>
+      <w:pPr>
+        <w:rPr>
+          <w:rFonts w:ascii="Arial" w:hAnsi="Arial" w:cs="Arial"/>
+        </w:rPr>
+      </w:pPr>
+      <w:r>
+        <w:rPr>
+          <w:rFonts w:ascii="Arial" w:hAnsi="Arial" w:cs="Arial"/>
+        </w:rPr>
+        <w:t>Since the dataset contains Sinhala characters, special attention was given to encoding and visualization:</w:t>
+      </w:r>
+    </w:p>
+    <w:p>
+      <w:pPr>
+        <w:numPr>
+          <w:ilvl w:val="0"/>
+          <w:numId w:val="32"/>
+        </w:numPr>
+        <w:rPr>
+          <w:rFonts w:ascii="Arial" w:hAnsi="Arial" w:cs="Arial"/>
+        </w:rPr>
+      </w:pPr>
+      <w:r>
+        <w:rPr>
+          <w:rFonts w:ascii="Arial" w:hAnsi="Arial" w:cs="Arial"/>
+        </w:rPr>
+        <w:t>UTF-8 encoding was ensured throughout the dataset</w:t>
+      </w:r>
+    </w:p>
+    <w:p>
+      <w:pPr>
+        <w:numPr>
+          <w:ilvl w:val="0"/>
+          <w:numId w:val="32"/>
+        </w:numPr>
+        <w:rPr>
+          <w:rFonts w:ascii="Arial" w:hAnsi="Arial" w:cs="Arial"/>
+        </w:rPr>
+      </w:pPr>
+      <w:r>
+        <w:rPr>
+          <w:rFonts w:ascii="Arial" w:hAnsi="Arial" w:cs="Arial"/>
+        </w:rPr>
+        <w:t>Font issues in visualization libraries were handled to correctly display Sinhala text</w:t>
+      </w:r>
+    </w:p>
+    <w:p>
+      <w:pPr>
+        <w:rPr>
+          <w:rFonts w:ascii="Arial" w:hAnsi="Arial" w:cs="Arial"/>
+          <w:b/>
+          <w:bCs/>
+        </w:rPr>
+      </w:pPr>
+      <w:r>
+        <w:rPr>
+          <w:rFonts w:ascii="Arial" w:hAnsi="Arial" w:cs="Arial"/>
+          <w:b/>
+          <w:bCs/>
+        </w:rPr>
+        <w:t>4.4 Target-Type Assignment</w:t>
+      </w:r>
+    </w:p>
+    <w:p>
+      <w:pPr>
+        <w:rPr>
+          <w:rFonts w:ascii="Arial" w:hAnsi="Arial" w:cs="Arial"/>
+        </w:rPr>
+      </w:pPr>
+      <w:r>
+        <w:rPr>
+          <w:rFonts w:ascii="Arial" w:hAnsi="Arial" w:cs="Arial"/>
+        </w:rPr>
+        <w:t xml:space="preserve">A rule-based approach was used to assign values to the </w:t>
+      </w:r>
+      <w:proofErr w:type="spellStart"/>
+      <w:r>
+        <w:rPr>
+          <w:rFonts w:ascii="Arial" w:hAnsi="Arial" w:cs="Arial"/>
         </w:rPr>
         <w:t>target_type</w:t>
       </w:r>
@@ -617,40 +1222,35 @@
         <w:rPr>
           <w:rFonts w:ascii="Arial" w:hAnsi="Arial" w:cs="Arial"/>
         </w:rPr>
-        <w:t xml:space="preserve"> was introduced. This column categorizes offensive language based on its intended target:</w:t>
+        <w:t xml:space="preserve"> column. This involved analyzing the meaning and usage context of each word and mapping it to the appropriate target category.</w:t>
       </w:r>
     </w:p>
     <w:p>
       <w:pPr>
-        <w:numPr>
-          <w:ilvl w:val="0"/>
-          <w:numId w:val="28"/>
-        </w:numPr>
-        <w:rPr>
-          <w:rFonts w:ascii="Arial" w:hAnsi="Arial" w:cs="Arial"/>
-        </w:rPr>
-      </w:pPr>
-      <w:r>
+        <w:rPr>
+          <w:rFonts w:ascii="Arial" w:hAnsi="Arial" w:cs="Arial"/>
+        </w:rPr>
+      </w:pPr>
+    </w:p>
+    <w:p>
+      <w:pPr>
         <w:rPr>
           <w:rFonts w:ascii="Arial" w:hAnsi="Arial" w:cs="Arial"/>
           <w:b/>
           <w:bCs/>
         </w:rPr>
-        <w:t>IND (Individual)</w:t>
-      </w:r>
+      </w:pPr>
       <w:r>
         <w:rPr>
           <w:rFonts w:ascii="Arial" w:hAnsi="Arial" w:cs="Arial"/>
-        </w:rPr>
-        <w:t>: Offensive language directed at a specific person</w:t>
+          <w:b/>
+          <w:bCs/>
+        </w:rPr>
+        <w:t>5. Methodology</w:t>
       </w:r>
     </w:p>
     <w:p>
       <w:pPr>
-        <w:numPr>
-          <w:ilvl w:val="0"/>
-          <w:numId w:val="28"/>
-        </w:numPr>
         <w:rPr>
           <w:rFonts w:ascii="Arial" w:hAnsi="Arial" w:cs="Arial"/>
         </w:rPr>
@@ -658,49 +1258,32 @@
       <w:r>
         <w:rPr>
           <w:rFonts w:ascii="Arial" w:hAnsi="Arial" w:cs="Arial"/>
-          <w:b/>
-          <w:bCs/>
-        </w:rPr>
-        <w:t>GRP (Group)</w:t>
-      </w:r>
-      <w:r>
-        <w:rPr>
-          <w:rFonts w:ascii="Arial" w:hAnsi="Arial" w:cs="Arial"/>
-        </w:rPr>
-        <w:t>: Language targeting a group defined by shared characteristics (e.g., gender, race)</w:t>
+        </w:rPr>
+        <w:t>The methodology adopted in this project is primarily analytical and rule-based.</w:t>
       </w:r>
     </w:p>
     <w:p>
       <w:pPr>
-        <w:numPr>
-          <w:ilvl w:val="0"/>
-          <w:numId w:val="28"/>
-        </w:numPr>
-        <w:rPr>
-          <w:rFonts w:ascii="Arial" w:hAnsi="Arial" w:cs="Arial"/>
-        </w:rPr>
-      </w:pPr>
-      <w:r>
         <w:rPr>
           <w:rFonts w:ascii="Arial" w:hAnsi="Arial" w:cs="Arial"/>
           <w:b/>
           <w:bCs/>
         </w:rPr>
-        <w:lastRenderedPageBreak/>
-        <w:t>UNT (Untargeted)</w:t>
-      </w:r>
+      </w:pPr>
       <w:r>
         <w:rPr>
           <w:rFonts w:ascii="Arial" w:hAnsi="Arial" w:cs="Arial"/>
-        </w:rPr>
-        <w:t>: General offensive expressions without a specific target</w:t>
+          <w:b/>
+          <w:bCs/>
+        </w:rPr>
+        <w:t>5.1 Classification Strategy</w:t>
       </w:r>
     </w:p>
     <w:p>
       <w:pPr>
         <w:numPr>
           <w:ilvl w:val="0"/>
-          <w:numId w:val="28"/>
+          <w:numId w:val="33"/>
         </w:numPr>
         <w:rPr>
           <w:rFonts w:ascii="Arial" w:hAnsi="Arial" w:cs="Arial"/>
@@ -709,54 +1292,46 @@
       <w:r>
         <w:rPr>
           <w:rFonts w:ascii="Arial" w:hAnsi="Arial" w:cs="Arial"/>
-          <w:b/>
-          <w:bCs/>
-        </w:rPr>
-        <w:t>OTH (Organization/Event)</w:t>
-      </w:r>
-      <w:r>
-        <w:rPr>
-          <w:rFonts w:ascii="Arial" w:hAnsi="Arial" w:cs="Arial"/>
-        </w:rPr>
-        <w:t>: Language targeting institutions, organizations, or events</w:t>
+        </w:rPr>
+        <w:t>Offensive words were categorized based on predefined semantic labels</w:t>
       </w:r>
     </w:p>
     <w:p>
       <w:pPr>
-        <w:rPr>
-          <w:rFonts w:ascii="Arial" w:hAnsi="Arial" w:cs="Arial"/>
-          <w:b/>
-          <w:bCs/>
+        <w:numPr>
+          <w:ilvl w:val="0"/>
+          <w:numId w:val="33"/>
+        </w:numPr>
+        <w:rPr>
+          <w:rFonts w:ascii="Arial" w:hAnsi="Arial" w:cs="Arial"/>
         </w:rPr>
       </w:pPr>
       <w:r>
         <w:rPr>
           <w:rFonts w:ascii="Arial" w:hAnsi="Arial" w:cs="Arial"/>
-          <w:b/>
-          <w:bCs/>
-        </w:rPr>
-        <w:t>3.2 Multi-Category Entries</w:t>
+        </w:rPr>
+        <w:t>Target types were assigned using linguistic interpretation and contextual understanding</w:t>
       </w:r>
     </w:p>
     <w:p>
       <w:pPr>
         <w:rPr>
           <w:rFonts w:ascii="Arial" w:hAnsi="Arial" w:cs="Arial"/>
+          <w:b/>
+          <w:bCs/>
         </w:rPr>
       </w:pPr>
       <w:r>
         <w:rPr>
           <w:rFonts w:ascii="Arial" w:hAnsi="Arial" w:cs="Arial"/>
-        </w:rPr>
-        <w:t>A notable characteristic of the dataset is that some entries belong to multiple categories. For example:</w:t>
+          <w:b/>
+          <w:bCs/>
+        </w:rPr>
+        <w:t>5.2 Frequency Analysis</w:t>
       </w:r>
     </w:p>
     <w:p>
       <w:pPr>
-        <w:numPr>
-          <w:ilvl w:val="0"/>
-          <w:numId w:val="29"/>
-        </w:numPr>
         <w:rPr>
           <w:rFonts w:ascii="Arial" w:hAnsi="Arial" w:cs="Arial"/>
         </w:rPr>
@@ -764,10 +1339,8 @@
       <w:r>
         <w:rPr>
           <w:rFonts w:ascii="Arial" w:hAnsi="Arial" w:cs="Arial"/>
-          <w:i/>
-          <w:iCs/>
-        </w:rPr>
-        <w:t>"Disability, Gender"</w:t>
+        </w:rPr>
+        <w:t>Frequency analysis was conducted to understand the distribution of offensive language:</w:t>
       </w:r>
     </w:p>
     <w:p>
@@ -776,11 +1349,61 @@
           <w:rFonts w:ascii="Arial" w:hAnsi="Arial" w:cs="Arial"/>
         </w:rPr>
       </w:pPr>
+      <w:proofErr w:type="spellStart"/>
       <w:r>
         <w:rPr>
           <w:rFonts w:ascii="Arial" w:hAnsi="Arial" w:cs="Arial"/>
         </w:rPr>
-        <w:t>Such cases reflect the overlapping nature of offensive language, where a single term may simultaneously target multiple social dimensions. Handling these entries required additional preprocessing steps to ensure accurate analysis.</w:t>
+        <w:t>df_off</w:t>
+      </w:r>
+      <w:proofErr w:type="spellEnd"/>
+      <w:r>
+        <w:rPr>
+          <w:rFonts w:ascii="Arial" w:hAnsi="Arial" w:cs="Arial"/>
+        </w:rPr>
+        <w:t>['</w:t>
+      </w:r>
+      <w:proofErr w:type="spellStart"/>
+      <w:r>
+        <w:rPr>
+          <w:rFonts w:ascii="Arial" w:hAnsi="Arial" w:cs="Arial"/>
+        </w:rPr>
+        <w:t>off_word_count</w:t>
+      </w:r>
+      <w:proofErr w:type="spellEnd"/>
+      <w:r>
+        <w:rPr>
+          <w:rFonts w:ascii="Arial" w:hAnsi="Arial" w:cs="Arial"/>
+        </w:rPr>
+        <w:t>'].</w:t>
+      </w:r>
+      <w:proofErr w:type="spellStart"/>
+      <w:r>
+        <w:rPr>
+          <w:rFonts w:ascii="Arial" w:hAnsi="Arial" w:cs="Arial"/>
+        </w:rPr>
+        <w:t>value_counts</w:t>
+      </w:r>
+      <w:proofErr w:type="spellEnd"/>
+      <w:r>
+        <w:rPr>
+          <w:rFonts w:ascii="Arial" w:hAnsi="Arial" w:cs="Arial"/>
+        </w:rPr>
+        <w:t>().</w:t>
+      </w:r>
+      <w:proofErr w:type="spellStart"/>
+      <w:r>
+        <w:rPr>
+          <w:rFonts w:ascii="Arial" w:hAnsi="Arial" w:cs="Arial"/>
+        </w:rPr>
+        <w:t>sort_index</w:t>
+      </w:r>
+      <w:proofErr w:type="spellEnd"/>
+      <w:r>
+        <w:rPr>
+          <w:rFonts w:ascii="Arial" w:hAnsi="Arial" w:cs="Arial"/>
+        </w:rPr>
+        <w:t>()</w:t>
       </w:r>
     </w:p>
     <w:p>
@@ -793,8 +1416,679 @@
         <w:rPr>
           <w:rFonts w:ascii="Arial" w:hAnsi="Arial" w:cs="Arial"/>
         </w:rPr>
-        <w:pict w14:anchorId="659F4F97">
-          <v:rect id="_x0000_i1208" style="width:0;height:1.5pt" o:hralign="center" o:hrstd="t" o:hr="t" fillcolor="#a0a0a0" stroked="f"/>
+        <w:t>This operation:</w:t>
+      </w:r>
+    </w:p>
+    <w:p>
+      <w:pPr>
+        <w:numPr>
+          <w:ilvl w:val="0"/>
+          <w:numId w:val="34"/>
+        </w:numPr>
+        <w:rPr>
+          <w:rFonts w:ascii="Arial" w:hAnsi="Arial" w:cs="Arial"/>
+        </w:rPr>
+      </w:pPr>
+      <w:r>
+        <w:rPr>
+          <w:rFonts w:ascii="Arial" w:hAnsi="Arial" w:cs="Arial"/>
+        </w:rPr>
+        <w:t>Counts the number of occurrences of offensive word counts</w:t>
+      </w:r>
+    </w:p>
+    <w:p>
+      <w:pPr>
+        <w:numPr>
+          <w:ilvl w:val="0"/>
+          <w:numId w:val="34"/>
+        </w:numPr>
+        <w:rPr>
+          <w:rFonts w:ascii="Arial" w:hAnsi="Arial" w:cs="Arial"/>
+        </w:rPr>
+      </w:pPr>
+      <w:r>
+        <w:rPr>
+          <w:rFonts w:ascii="Arial" w:hAnsi="Arial" w:cs="Arial"/>
+        </w:rPr>
+        <w:t>Sorts the results in ascending order</w:t>
+      </w:r>
+    </w:p>
+    <w:p>
+      <w:pPr>
+        <w:numPr>
+          <w:ilvl w:val="0"/>
+          <w:numId w:val="34"/>
+        </w:numPr>
+        <w:rPr>
+          <w:rFonts w:ascii="Arial" w:hAnsi="Arial" w:cs="Arial"/>
+        </w:rPr>
+      </w:pPr>
+      <w:r>
+        <w:rPr>
+          <w:rFonts w:ascii="Arial" w:hAnsi="Arial" w:cs="Arial"/>
+        </w:rPr>
+        <w:t>Helps identify common and rare patterns in the dataset</w:t>
+      </w:r>
+    </w:p>
+    <w:p>
+      <w:pPr>
+        <w:rPr>
+          <w:rFonts w:ascii="Arial" w:hAnsi="Arial" w:cs="Arial"/>
+          <w:b/>
+          <w:bCs/>
+        </w:rPr>
+      </w:pPr>
+      <w:r>
+        <w:rPr>
+          <w:rFonts w:ascii="Arial" w:hAnsi="Arial" w:cs="Arial"/>
+          <w:b/>
+          <w:bCs/>
+        </w:rPr>
+        <w:t>5.3 Analytical Approach</w:t>
+      </w:r>
+    </w:p>
+    <w:p>
+      <w:pPr>
+        <w:rPr>
+          <w:rFonts w:ascii="Arial" w:hAnsi="Arial" w:cs="Arial"/>
+        </w:rPr>
+      </w:pPr>
+      <w:r>
+        <w:rPr>
+          <w:rFonts w:ascii="Arial" w:hAnsi="Arial" w:cs="Arial"/>
+        </w:rPr>
+        <w:t>The analysis focused on:</w:t>
+      </w:r>
+    </w:p>
+    <w:p>
+      <w:pPr>
+        <w:numPr>
+          <w:ilvl w:val="0"/>
+          <w:numId w:val="35"/>
+        </w:numPr>
+        <w:rPr>
+          <w:rFonts w:ascii="Arial" w:hAnsi="Arial" w:cs="Arial"/>
+        </w:rPr>
+      </w:pPr>
+      <w:r>
+        <w:rPr>
+          <w:rFonts w:ascii="Arial" w:hAnsi="Arial" w:cs="Arial"/>
+        </w:rPr>
+        <w:lastRenderedPageBreak/>
+        <w:t>Category frequency distribution</w:t>
+      </w:r>
+    </w:p>
+    <w:p>
+      <w:pPr>
+        <w:numPr>
+          <w:ilvl w:val="0"/>
+          <w:numId w:val="35"/>
+        </w:numPr>
+        <w:rPr>
+          <w:rFonts w:ascii="Arial" w:hAnsi="Arial" w:cs="Arial"/>
+        </w:rPr>
+      </w:pPr>
+      <w:r>
+        <w:rPr>
+          <w:rFonts w:ascii="Arial" w:hAnsi="Arial" w:cs="Arial"/>
+        </w:rPr>
+        <w:t>Target-type distribution</w:t>
+      </w:r>
+    </w:p>
+    <w:p>
+      <w:pPr>
+        <w:numPr>
+          <w:ilvl w:val="0"/>
+          <w:numId w:val="35"/>
+        </w:numPr>
+        <w:rPr>
+          <w:rFonts w:ascii="Arial" w:hAnsi="Arial" w:cs="Arial"/>
+        </w:rPr>
+      </w:pPr>
+      <w:r>
+        <w:rPr>
+          <w:rFonts w:ascii="Arial" w:hAnsi="Arial" w:cs="Arial"/>
+        </w:rPr>
+        <w:t>Co-occurrence of multiple categories</w:t>
+      </w:r>
+    </w:p>
+    <w:p>
+      <w:pPr>
+        <w:rPr>
+          <w:rFonts w:ascii="Arial" w:hAnsi="Arial" w:cs="Arial"/>
+        </w:rPr>
+      </w:pPr>
+    </w:p>
+    <w:p>
+      <w:pPr>
+        <w:rPr>
+          <w:rFonts w:ascii="Arial" w:hAnsi="Arial" w:cs="Arial"/>
+          <w:b/>
+          <w:bCs/>
+        </w:rPr>
+      </w:pPr>
+      <w:r>
+        <w:rPr>
+          <w:rFonts w:ascii="Arial" w:hAnsi="Arial" w:cs="Arial"/>
+          <w:b/>
+          <w:bCs/>
+        </w:rPr>
+        <w:t>6. Data Analysis and Visualization</w:t>
+      </w:r>
+    </w:p>
+    <w:p>
+      <w:pPr>
+        <w:rPr>
+          <w:rFonts w:ascii="Arial" w:hAnsi="Arial" w:cs="Arial"/>
+        </w:rPr>
+      </w:pPr>
+      <w:r>
+        <w:rPr>
+          <w:rFonts w:ascii="Arial" w:hAnsi="Arial" w:cs="Arial"/>
+        </w:rPr>
+        <w:t>Exploratory Data Analysis (EDA) was performed to extract meaningful insights.</w:t>
+      </w:r>
+    </w:p>
+    <w:p>
+      <w:pPr>
+        <w:rPr>
+          <w:rFonts w:ascii="Arial" w:hAnsi="Arial" w:cs="Arial"/>
+          <w:b/>
+          <w:bCs/>
+        </w:rPr>
+      </w:pPr>
+      <w:r>
+        <w:rPr>
+          <w:rFonts w:ascii="Arial" w:hAnsi="Arial" w:cs="Arial"/>
+          <w:b/>
+          <w:bCs/>
+        </w:rPr>
+        <w:t>6.1 Category Distribution Analysis</w:t>
+      </w:r>
+    </w:p>
+    <w:p>
+      <w:pPr>
+        <w:rPr>
+          <w:rFonts w:ascii="Arial" w:hAnsi="Arial" w:cs="Arial"/>
+        </w:rPr>
+      </w:pPr>
+      <w:r>
+        <w:rPr>
+          <w:rFonts w:ascii="Arial" w:hAnsi="Arial" w:cs="Arial"/>
+        </w:rPr>
+        <w:t>The frequency of each category was computed to identify dominant types of offensive language. The use of exploded data ensured that multi-category entries were accurately represented.</w:t>
+      </w:r>
+    </w:p>
+    <w:p>
+      <w:pPr>
+        <w:rPr>
+          <w:rFonts w:ascii="Arial" w:hAnsi="Arial" w:cs="Arial"/>
+        </w:rPr>
+      </w:pPr>
+      <w:r>
+        <w:rPr>
+          <w:rFonts w:ascii="Arial" w:hAnsi="Arial" w:cs="Arial"/>
+        </w:rPr>
+        <w:t>A</w:t>
+      </w:r>
+      <w:r>
+        <w:rPr>
+          <w:rFonts w:ascii="Arial" w:hAnsi="Arial" w:cs="Arial"/>
+        </w:rPr>
+        <w:t>s shown in Figure 4, gender-related offensive language appears as the most dominant category in the dataset. This indicates that insults targeting gender are significantly more prevalent compared to other categories such as disability and age. Furthermore, the presence of multi-category entries highlights the intersectionality of offensive language, where a single expression may simultaneously target multiple social dimensions.</w:t>
+      </w:r>
+    </w:p>
+    <w:p>
+      <w:pPr>
+        <w:keepNext/>
+      </w:pPr>
+      <w:r>
+        <w:rPr>
+          <w:rFonts w:ascii="Arial" w:hAnsi="Arial" w:cs="Arial"/>
+        </w:rPr>
+        <w:lastRenderedPageBreak/>
+        <w:drawing>
+          <wp:inline distT="0" distB="0" distL="0" distR="0" wp14:anchorId="652520D9" wp14:editId="6F099D21">
+            <wp:extent cx="5486400" cy="4886960"/>
+            <wp:effectExtent l="0" t="0" r="0" b="8890"/>
+            <wp:docPr id="322052550" name="Picture 1"/>
+            <wp:cNvGraphicFramePr>
+              <a:graphicFrameLocks xmlns:a="http://schemas.openxmlformats.org/drawingml/2006/main" noChangeAspect="1"/>
+            </wp:cNvGraphicFramePr>
+            <a:graphic xmlns:a="http://schemas.openxmlformats.org/drawingml/2006/main">
+              <a:graphicData uri="http://schemas.openxmlformats.org/drawingml/2006/picture">
+                <pic:pic xmlns:pic="http://schemas.openxmlformats.org/drawingml/2006/picture">
+                  <pic:nvPicPr>
+                    <pic:cNvPr id="322052550" name=""/>
+                    <pic:cNvPicPr/>
+                  </pic:nvPicPr>
+                  <pic:blipFill>
+                    <a:blip r:embed="rId7"/>
+                    <a:stretch>
+                      <a:fillRect/>
+                    </a:stretch>
+                  </pic:blipFill>
+                  <pic:spPr>
+                    <a:xfrm>
+                      <a:off x="0" y="0"/>
+                      <a:ext cx="5486400" cy="4886960"/>
+                    </a:xfrm>
+                    <a:prstGeom prst="rect">
+                      <a:avLst/>
+                    </a:prstGeom>
+                  </pic:spPr>
+                </pic:pic>
+              </a:graphicData>
+            </a:graphic>
+          </wp:inline>
+        </w:drawing>
+      </w:r>
+    </w:p>
+    <w:p>
+      <w:pPr>
+        <w:pStyle w:val="Caption"/>
+      </w:pPr>
+      <w:r>
+        <w:t xml:space="preserve">Figure </w:t>
+      </w:r>
+      <w:fldSimple w:instr=" SEQ Figure \* ARABIC ">
+        <w:r>
+          <w:rPr>
+            <w:noProof/>
+          </w:rPr>
+          <w:t>2</w:t>
+        </w:r>
+      </w:fldSimple>
+      <w:r>
+        <w:t xml:space="preserve">: </w:t>
+      </w:r>
+      <w:r>
+        <w:t>Distribution of offensive language categories, showing gender as the most frequent category.</w:t>
+      </w:r>
+    </w:p>
+    <w:p>
+      <w:pPr>
+        <w:keepNext/>
+      </w:pPr>
+      <w:r>
+        <w:lastRenderedPageBreak/>
+        <w:drawing>
+          <wp:inline distT="0" distB="0" distL="0" distR="0" wp14:anchorId="77CBE0FB" wp14:editId="35F1E78B">
+            <wp:extent cx="5486400" cy="3235325"/>
+            <wp:effectExtent l="0" t="0" r="0" b="3175"/>
+            <wp:docPr id="584658157" name="Picture 1"/>
+            <wp:cNvGraphicFramePr>
+              <a:graphicFrameLocks xmlns:a="http://schemas.openxmlformats.org/drawingml/2006/main" noChangeAspect="1"/>
+            </wp:cNvGraphicFramePr>
+            <a:graphic xmlns:a="http://schemas.openxmlformats.org/drawingml/2006/main">
+              <a:graphicData uri="http://schemas.openxmlformats.org/drawingml/2006/picture">
+                <pic:pic xmlns:pic="http://schemas.openxmlformats.org/drawingml/2006/picture">
+                  <pic:nvPicPr>
+                    <pic:cNvPr id="584658157" name=""/>
+                    <pic:cNvPicPr/>
+                  </pic:nvPicPr>
+                  <pic:blipFill>
+                    <a:blip r:embed="rId8"/>
+                    <a:stretch>
+                      <a:fillRect/>
+                    </a:stretch>
+                  </pic:blipFill>
+                  <pic:spPr>
+                    <a:xfrm>
+                      <a:off x="0" y="0"/>
+                      <a:ext cx="5486400" cy="3235325"/>
+                    </a:xfrm>
+                    <a:prstGeom prst="rect">
+                      <a:avLst/>
+                    </a:prstGeom>
+                  </pic:spPr>
+                </pic:pic>
+              </a:graphicData>
+            </a:graphic>
+          </wp:inline>
+        </w:drawing>
+      </w:r>
+    </w:p>
+    <w:p>
+      <w:pPr>
+        <w:pStyle w:val="Caption"/>
+      </w:pPr>
+      <w:r>
+        <w:t xml:space="preserve">Figure </w:t>
+      </w:r>
+      <w:fldSimple w:instr=" SEQ Figure \* ARABIC ">
+        <w:r>
+          <w:rPr>
+            <w:noProof/>
+          </w:rPr>
+          <w:t>3</w:t>
+        </w:r>
+      </w:fldSimple>
+    </w:p>
+    <w:p>
+      <w:pPr>
+        <w:rPr>
+          <w:rFonts w:ascii="Arial" w:hAnsi="Arial" w:cs="Arial"/>
+          <w:b/>
+          <w:bCs/>
+        </w:rPr>
+      </w:pPr>
+      <w:r>
+        <w:rPr>
+          <w:rFonts w:ascii="Arial" w:hAnsi="Arial" w:cs="Arial"/>
+          <w:b/>
+          <w:bCs/>
+        </w:rPr>
+        <w:t>6.2 Target-Type Distribution</w:t>
+      </w:r>
+    </w:p>
+    <w:p>
+      <w:pPr>
+        <w:rPr>
+          <w:rFonts w:ascii="Arial" w:hAnsi="Arial" w:cs="Arial"/>
+        </w:rPr>
+      </w:pPr>
+      <w:r>
+        <w:rPr>
+          <w:rFonts w:ascii="Arial" w:hAnsi="Arial" w:cs="Arial"/>
+        </w:rPr>
+        <w:t>The distribution of target types (IND, GRP, UNT, OTH) was analyzed to understand how offensive language is directed. This provides insight into whether offensive expressions are more personalized or generalized.</w:t>
+      </w:r>
+    </w:p>
+    <w:p>
+      <w:pPr>
+        <w:rPr>
+          <w:rFonts w:ascii="Arial" w:hAnsi="Arial" w:cs="Arial"/>
+        </w:rPr>
+      </w:pPr>
+      <w:r>
+        <w:rPr>
+          <w:rFonts w:ascii="Arial" w:hAnsi="Arial" w:cs="Arial"/>
+        </w:rPr>
+        <w:t>Figure 5 illustrates that the majority of offensive expressions are directed toward individuals (IND) and groups (GRP). In contrast, fewer instances are categorized as untargeted (UNT) or directed at organizations (OTH). This suggests that offensive language is predominantly used in a targeted manner, focusing on specific individuals or identifiable groups rather than being used in a general context.</w:t>
+      </w:r>
+    </w:p>
+    <w:p>
+      <w:pPr>
+        <w:keepNext/>
+      </w:pPr>
+      <w:r>
+        <w:lastRenderedPageBreak/>
+        <w:drawing>
+          <wp:inline distT="0" distB="0" distL="0" distR="0" wp14:anchorId="3161DEA1" wp14:editId="12A69B03">
+            <wp:extent cx="5342083" cy="3558848"/>
+            <wp:effectExtent l="0" t="0" r="0" b="3810"/>
+            <wp:docPr id="33455064" name="Picture 1"/>
+            <wp:cNvGraphicFramePr>
+              <a:graphicFrameLocks xmlns:a="http://schemas.openxmlformats.org/drawingml/2006/main" noChangeAspect="1"/>
+            </wp:cNvGraphicFramePr>
+            <a:graphic xmlns:a="http://schemas.openxmlformats.org/drawingml/2006/main">
+              <a:graphicData uri="http://schemas.openxmlformats.org/drawingml/2006/picture">
+                <pic:pic xmlns:pic="http://schemas.openxmlformats.org/drawingml/2006/picture">
+                  <pic:nvPicPr>
+                    <pic:cNvPr id="33455064" name=""/>
+                    <pic:cNvPicPr/>
+                  </pic:nvPicPr>
+                  <pic:blipFill>
+                    <a:blip r:embed="rId9"/>
+                    <a:stretch>
+                      <a:fillRect/>
+                    </a:stretch>
+                  </pic:blipFill>
+                  <pic:spPr>
+                    <a:xfrm>
+                      <a:off x="0" y="0"/>
+                      <a:ext cx="5342083" cy="3558848"/>
+                    </a:xfrm>
+                    <a:prstGeom prst="rect">
+                      <a:avLst/>
+                    </a:prstGeom>
+                  </pic:spPr>
+                </pic:pic>
+              </a:graphicData>
+            </a:graphic>
+          </wp:inline>
+        </w:drawing>
+      </w:r>
+    </w:p>
+    <w:p>
+      <w:pPr>
+        <w:pStyle w:val="Caption"/>
+        <w:rPr>
+          <w:rFonts w:ascii="Arial" w:hAnsi="Arial" w:cs="Arial"/>
+          <w:color w:val="EE0000"/>
+        </w:rPr>
+      </w:pPr>
+      <w:r>
+        <w:t xml:space="preserve">Figure </w:t>
+      </w:r>
+      <w:fldSimple w:instr=" SEQ Figure \* ARABIC ">
+        <w:r>
+          <w:rPr>
+            <w:noProof/>
+          </w:rPr>
+          <w:t>4</w:t>
+        </w:r>
+      </w:fldSimple>
+      <w:r>
+        <w:t>:</w:t>
+      </w:r>
+      <w:r>
+        <w:t>Distribution of target types indicating that most offensive expressions are directed toward individuals and groups.</w:t>
+      </w:r>
+    </w:p>
+    <w:p>
+      <w:pPr>
+        <w:rPr>
+          <w:rFonts w:ascii="Arial" w:hAnsi="Arial" w:cs="Arial"/>
+          <w:b/>
+          <w:bCs/>
+        </w:rPr>
+      </w:pPr>
+      <w:r>
+        <w:rPr>
+          <w:rFonts w:ascii="Arial" w:hAnsi="Arial" w:cs="Arial"/>
+          <w:b/>
+          <w:bCs/>
+        </w:rPr>
+        <w:t>6.3 Offensive Word Count Distribution</w:t>
+      </w:r>
+    </w:p>
+    <w:p>
+      <w:pPr>
+        <w:rPr>
+          <w:rFonts w:ascii="Arial" w:hAnsi="Arial" w:cs="Arial"/>
+        </w:rPr>
+      </w:pPr>
+      <w:r>
+        <w:rPr>
+          <w:rFonts w:ascii="Arial" w:hAnsi="Arial" w:cs="Arial"/>
+        </w:rPr>
+        <w:t>Histograms were used to analyze the number of offensive words per entry.</w:t>
+      </w:r>
+    </w:p>
+    <w:p>
+      <w:pPr>
+        <w:rPr>
+          <w:rFonts w:ascii="Arial" w:hAnsi="Arial" w:cs="Arial"/>
+        </w:rPr>
+      </w:pPr>
+      <w:r>
+        <w:rPr>
+          <w:rFonts w:ascii="Arial" w:hAnsi="Arial" w:cs="Arial"/>
+        </w:rPr>
+        <w:t>As shown in Figure 6, the distribution of offensive word counts reveals that most entries contain a small number of offensive words. The frequency decreases as the number of words increases, indicating that offensive expressions are typically short and concise rather than extended phrases. This pattern reflects the nature of informal communication, where brief expressions are commonly used.</w:t>
+      </w:r>
+    </w:p>
+    <w:p>
+      <w:pPr>
+        <w:keepNext/>
+      </w:pPr>
+      <w:r>
+        <w:rPr>
+          <w:rFonts w:ascii="Arial" w:hAnsi="Arial" w:cs="Arial"/>
+          <w:b/>
+          <w:bCs/>
+          <w:color w:val="EE0000"/>
+        </w:rPr>
+        <w:lastRenderedPageBreak/>
+        <w:drawing>
+          <wp:inline distT="0" distB="0" distL="0" distR="0" wp14:anchorId="36E21ED6" wp14:editId="62B5D97C">
+            <wp:extent cx="5486400" cy="3625850"/>
+            <wp:effectExtent l="0" t="0" r="0" b="0"/>
+            <wp:docPr id="452584019" name="Picture 1"/>
+            <wp:cNvGraphicFramePr>
+              <a:graphicFrameLocks xmlns:a="http://schemas.openxmlformats.org/drawingml/2006/main" noChangeAspect="1"/>
+            </wp:cNvGraphicFramePr>
+            <a:graphic xmlns:a="http://schemas.openxmlformats.org/drawingml/2006/main">
+              <a:graphicData uri="http://schemas.openxmlformats.org/drawingml/2006/picture">
+                <pic:pic xmlns:pic="http://schemas.openxmlformats.org/drawingml/2006/picture">
+                  <pic:nvPicPr>
+                    <pic:cNvPr id="452584019" name=""/>
+                    <pic:cNvPicPr/>
+                  </pic:nvPicPr>
+                  <pic:blipFill>
+                    <a:blip r:embed="rId10"/>
+                    <a:stretch>
+                      <a:fillRect/>
+                    </a:stretch>
+                  </pic:blipFill>
+                  <pic:spPr>
+                    <a:xfrm>
+                      <a:off x="0" y="0"/>
+                      <a:ext cx="5486400" cy="3625850"/>
+                    </a:xfrm>
+                    <a:prstGeom prst="rect">
+                      <a:avLst/>
+                    </a:prstGeom>
+                  </pic:spPr>
+                </pic:pic>
+              </a:graphicData>
+            </a:graphic>
+          </wp:inline>
+        </w:drawing>
+      </w:r>
+    </w:p>
+    <w:p>
+      <w:pPr>
+        <w:pStyle w:val="Caption"/>
+        <w:rPr>
+          <w:rFonts w:ascii="Arial" w:hAnsi="Arial" w:cs="Arial"/>
+          <w:color w:val="EE0000"/>
+        </w:rPr>
+      </w:pPr>
+      <w:r>
+        <w:t xml:space="preserve">Figure </w:t>
+      </w:r>
+      <w:fldSimple w:instr=" SEQ Figure \* ARABIC ">
+        <w:r>
+          <w:rPr>
+            <w:noProof/>
+          </w:rPr>
+          <w:t>5</w:t>
+        </w:r>
+      </w:fldSimple>
+      <w:r>
+        <w:t>:</w:t>
+      </w:r>
+      <w:r>
+        <w:t>Histogram showing the distribution of offensive word counts per entry</w:t>
+      </w:r>
+    </w:p>
+    <w:p>
+      <w:pPr>
+        <w:rPr>
+          <w:rFonts w:ascii="Arial" w:hAnsi="Arial" w:cs="Arial"/>
+          <w:b/>
+          <w:bCs/>
+        </w:rPr>
+      </w:pPr>
+      <w:r>
+        <w:rPr>
+          <w:rFonts w:ascii="Arial" w:hAnsi="Arial" w:cs="Arial"/>
+          <w:b/>
+          <w:bCs/>
+        </w:rPr>
+        <w:t xml:space="preserve">6.4 Most Frequent offensive words </w:t>
+      </w:r>
+    </w:p>
+    <w:p>
+      <w:pPr>
+        <w:keepNext/>
+      </w:pPr>
+      <w:r>
+        <w:rPr>
+          <w:rFonts w:ascii="Arial" w:hAnsi="Arial" w:cs="Arial"/>
+        </w:rPr>
+        <w:lastRenderedPageBreak/>
+        <w:drawing>
+          <wp:inline distT="0" distB="0" distL="0" distR="0" wp14:anchorId="7D81036F" wp14:editId="4E98A071">
+            <wp:extent cx="5486400" cy="4166870"/>
+            <wp:effectExtent l="0" t="0" r="0" b="5080"/>
+            <wp:docPr id="748515677" name="Picture 1"/>
+            <wp:cNvGraphicFramePr>
+              <a:graphicFrameLocks xmlns:a="http://schemas.openxmlformats.org/drawingml/2006/main" noChangeAspect="1"/>
+            </wp:cNvGraphicFramePr>
+            <a:graphic xmlns:a="http://schemas.openxmlformats.org/drawingml/2006/main">
+              <a:graphicData uri="http://schemas.openxmlformats.org/drawingml/2006/picture">
+                <pic:pic xmlns:pic="http://schemas.openxmlformats.org/drawingml/2006/picture">
+                  <pic:nvPicPr>
+                    <pic:cNvPr id="748515677" name=""/>
+                    <pic:cNvPicPr/>
+                  </pic:nvPicPr>
+                  <pic:blipFill>
+                    <a:blip r:embed="rId11"/>
+                    <a:stretch>
+                      <a:fillRect/>
+                    </a:stretch>
+                  </pic:blipFill>
+                  <pic:spPr>
+                    <a:xfrm>
+                      <a:off x="0" y="0"/>
+                      <a:ext cx="5486400" cy="4166870"/>
+                    </a:xfrm>
+                    <a:prstGeom prst="rect">
+                      <a:avLst/>
+                    </a:prstGeom>
+                  </pic:spPr>
+                </pic:pic>
+              </a:graphicData>
+            </a:graphic>
+          </wp:inline>
+        </w:drawing>
+      </w:r>
+    </w:p>
+    <w:p>
+      <w:pPr>
+        <w:pStyle w:val="Caption"/>
+        <w:rPr>
+          <w:rFonts w:ascii="Arial" w:hAnsi="Arial" w:cs="Arial"/>
+        </w:rPr>
+      </w:pPr>
+      <w:r>
+        <w:t xml:space="preserve">Figure </w:t>
+      </w:r>
+      <w:fldSimple w:instr=" SEQ Figure \* ARABIC ">
+        <w:r>
+          <w:rPr>
+            <w:noProof/>
+          </w:rPr>
+          <w:t>6</w:t>
+        </w:r>
+      </w:fldSimple>
+    </w:p>
+    <w:p>
+      <w:pPr>
+        <w:rPr>
+          <w:rFonts w:ascii="Arial" w:hAnsi="Arial" w:cs="Arial"/>
+        </w:rPr>
+      </w:pPr>
+      <w:r>
+        <w:rPr>
+          <w:rFonts w:ascii="Arial" w:hAnsi="Arial" w:cs="Arial"/>
+        </w:rPr>
+        <w:pict w14:anchorId="78C1A0D2">
+          <v:rect id="_x0000_i1031" style="width:0;height:1.5pt" o:hralign="center" o:hrstd="t" o:hr="t" fillcolor="#a0a0a0" stroked="f"/>
         </w:pict>
       </w:r>
     </w:p>
@@ -812,7 +2106,7 @@
           <w:b/>
           <w:bCs/>
         </w:rPr>
-        <w:t>4. Data Preprocessing</w:t>
+        <w:t>7. Results and Findings</w:t>
       </w:r>
     </w:p>
     <w:p>
@@ -825,28 +2119,40 @@
         <w:rPr>
           <w:rFonts w:ascii="Arial" w:hAnsi="Arial" w:cs="Arial"/>
         </w:rPr>
-        <w:t>Data preprocessing is a crucial step in ensuring the quality and reliability of analysis. Several preprocessing techniques were applied to the dataset.</w:t>
+        <w:t>The analysis produced several important findings:</w:t>
       </w:r>
     </w:p>
     <w:p>
       <w:pPr>
+        <w:numPr>
+          <w:ilvl w:val="0"/>
+          <w:numId w:val="37"/>
+        </w:numPr>
+        <w:rPr>
+          <w:rFonts w:ascii="Arial" w:hAnsi="Arial" w:cs="Arial"/>
+        </w:rPr>
+      </w:pPr>
+      <w:r>
         <w:rPr>
           <w:rFonts w:ascii="Arial" w:hAnsi="Arial" w:cs="Arial"/>
           <w:b/>
           <w:bCs/>
         </w:rPr>
-      </w:pPr>
+        <w:t>Gender-related offensive language</w:t>
+      </w:r>
       <w:r>
         <w:rPr>
           <w:rFonts w:ascii="Arial" w:hAnsi="Arial" w:cs="Arial"/>
-          <w:b/>
-          <w:bCs/>
-        </w:rPr>
-        <w:t>4.1 Data Cleaning</w:t>
+        </w:rPr>
+        <w:t xml:space="preserve"> was the most frequent category, indicating a strong presence of gender-based insults</w:t>
       </w:r>
     </w:p>
     <w:p>
       <w:pPr>
+        <w:numPr>
+          <w:ilvl w:val="0"/>
+          <w:numId w:val="37"/>
+        </w:numPr>
         <w:rPr>
           <w:rFonts w:ascii="Arial" w:hAnsi="Arial" w:cs="Arial"/>
         </w:rPr>
@@ -855,14 +2161,28 @@
         <w:rPr>
           <w:rFonts w:ascii="Arial" w:hAnsi="Arial" w:cs="Arial"/>
         </w:rPr>
-        <w:t>The dataset was cleaned to remove inconsistencies and improve readability:</w:t>
+        <w:t xml:space="preserve">A significant number of entries contained </w:t>
+      </w:r>
+      <w:r>
+        <w:rPr>
+          <w:rFonts w:ascii="Arial" w:hAnsi="Arial" w:cs="Arial"/>
+          <w:b/>
+          <w:bCs/>
+        </w:rPr>
+        <w:t>multiple categories</w:t>
+      </w:r>
+      <w:r>
+        <w:rPr>
+          <w:rFonts w:ascii="Arial" w:hAnsi="Arial" w:cs="Arial"/>
+        </w:rPr>
+        <w:t>, highlighting overlapping forms of discrimination</w:t>
       </w:r>
     </w:p>
     <w:p>
       <w:pPr>
         <w:numPr>
           <w:ilvl w:val="0"/>
-          <w:numId w:val="30"/>
+          <w:numId w:val="37"/>
         </w:numPr>
         <w:rPr>
           <w:rFonts w:ascii="Arial" w:hAnsi="Arial" w:cs="Arial"/>
@@ -872,14 +2192,36 @@
         <w:rPr>
           <w:rFonts w:ascii="Arial" w:hAnsi="Arial" w:cs="Arial"/>
         </w:rPr>
-        <w:t>Removal of unwanted characters such as brackets and extra whitespace</w:t>
+        <w:t xml:space="preserve">The majority of offensive expressions were directed toward </w:t>
+      </w:r>
+      <w:r>
+        <w:rPr>
+          <w:rFonts w:ascii="Arial" w:hAnsi="Arial" w:cs="Arial"/>
+          <w:b/>
+          <w:bCs/>
+        </w:rPr>
+        <w:t>individuals (IND)</w:t>
+      </w:r>
+      <w:r>
+        <w:rPr>
+          <w:rFonts w:ascii="Arial" w:hAnsi="Arial" w:cs="Arial"/>
+        </w:rPr>
+        <w:t xml:space="preserve"> and </w:t>
+      </w:r>
+      <w:r>
+        <w:rPr>
+          <w:rFonts w:ascii="Arial" w:hAnsi="Arial" w:cs="Arial"/>
+          <w:b/>
+          <w:bCs/>
+        </w:rPr>
+        <w:t>groups (GRP)</w:t>
       </w:r>
     </w:p>
     <w:p>
       <w:pPr>
         <w:numPr>
           <w:ilvl w:val="0"/>
-          <w:numId w:val="30"/>
+          <w:numId w:val="37"/>
         </w:numPr>
         <w:rPr>
           <w:rFonts w:ascii="Arial" w:hAnsi="Arial" w:cs="Arial"/>
@@ -889,15 +2231,11 @@
         <w:rPr>
           <w:rFonts w:ascii="Arial" w:hAnsi="Arial" w:cs="Arial"/>
         </w:rPr>
-        <w:t>Standardization of text formatting</w:t>
+        <w:t>The dataset showed a balanced distribution of offensiveness levels, with a concentration in the medium category</w:t>
       </w:r>
     </w:p>
     <w:p>
       <w:pPr>
-        <w:numPr>
-          <w:ilvl w:val="0"/>
-          <w:numId w:val="30"/>
-        </w:numPr>
         <w:rPr>
           <w:rFonts w:ascii="Arial" w:hAnsi="Arial" w:cs="Arial"/>
         </w:rPr>
@@ -906,354 +2244,21 @@
         <w:rPr>
           <w:rFonts w:ascii="Arial" w:hAnsi="Arial" w:cs="Arial"/>
         </w:rPr>
-        <w:t>Correction of inconsistent category labels</w:t>
+        <w:t>These findings demonstrate that offensive language is complex, multi-dimensional, and often context-dependent.</w:t>
       </w:r>
     </w:p>
     <w:p>
       <w:pPr>
         <w:rPr>
           <w:rFonts w:ascii="Arial" w:hAnsi="Arial" w:cs="Arial"/>
-          <w:b/>
-          <w:bCs/>
         </w:rPr>
       </w:pPr>
       <w:r>
         <w:rPr>
           <w:rFonts w:ascii="Arial" w:hAnsi="Arial" w:cs="Arial"/>
-          <w:b/>
-          <w:bCs/>
-        </w:rPr>
-        <w:t>4.2 Handling Multi-Label Categories</w:t>
-      </w:r>
-    </w:p>
-    <w:p>
-      <w:pPr>
-        <w:rPr>
-          <w:rFonts w:ascii="Arial" w:hAnsi="Arial" w:cs="Arial"/>
-        </w:rPr>
-      </w:pPr>
-      <w:r>
-        <w:rPr>
-          <w:rFonts w:ascii="Arial" w:hAnsi="Arial" w:cs="Arial"/>
-        </w:rPr>
-        <w:t>To properly analyze entries with multiple categories, the category column was transformed:</w:t>
-      </w:r>
-    </w:p>
-    <w:p>
-      <w:pPr>
-        <w:rPr>
-          <w:rFonts w:ascii="Arial" w:hAnsi="Arial" w:cs="Arial"/>
-        </w:rPr>
-      </w:pPr>
-      <w:proofErr w:type="spellStart"/>
-      <w:r>
-        <w:rPr>
-          <w:rFonts w:ascii="Arial" w:hAnsi="Arial" w:cs="Arial"/>
-        </w:rPr>
-        <w:t>df_off</w:t>
-      </w:r>
-      <w:proofErr w:type="spellEnd"/>
-      <w:r>
-        <w:rPr>
-          <w:rFonts w:ascii="Arial" w:hAnsi="Arial" w:cs="Arial"/>
-        </w:rPr>
-        <w:t>["</w:t>
-      </w:r>
-      <w:proofErr w:type="spellStart"/>
-      <w:r>
-        <w:rPr>
-          <w:rFonts w:ascii="Arial" w:hAnsi="Arial" w:cs="Arial"/>
-        </w:rPr>
-        <w:t>category_updated</w:t>
-      </w:r>
-      <w:proofErr w:type="spellEnd"/>
-      <w:r>
-        <w:rPr>
-          <w:rFonts w:ascii="Arial" w:hAnsi="Arial" w:cs="Arial"/>
-        </w:rPr>
-        <w:t xml:space="preserve">"] = </w:t>
-      </w:r>
-      <w:proofErr w:type="spellStart"/>
-      <w:r>
-        <w:rPr>
-          <w:rFonts w:ascii="Arial" w:hAnsi="Arial" w:cs="Arial"/>
-        </w:rPr>
-        <w:t>df_off</w:t>
-      </w:r>
-      <w:proofErr w:type="spellEnd"/>
-      <w:r>
-        <w:rPr>
-          <w:rFonts w:ascii="Arial" w:hAnsi="Arial" w:cs="Arial"/>
-        </w:rPr>
-        <w:t>["category"].</w:t>
-      </w:r>
-      <w:proofErr w:type="spellStart"/>
-      <w:proofErr w:type="gramStart"/>
-      <w:r>
-        <w:rPr>
-          <w:rFonts w:ascii="Arial" w:hAnsi="Arial" w:cs="Arial"/>
-        </w:rPr>
-        <w:t>str.split</w:t>
-      </w:r>
-      <w:proofErr w:type="spellEnd"/>
-      <w:proofErr w:type="gramEnd"/>
-      <w:r>
-        <w:rPr>
-          <w:rFonts w:ascii="Arial" w:hAnsi="Arial" w:cs="Arial"/>
-        </w:rPr>
-        <w:t>(",")</w:t>
-      </w:r>
-    </w:p>
-    <w:p>
-      <w:pPr>
-        <w:rPr>
-          <w:rFonts w:ascii="Arial" w:hAnsi="Arial" w:cs="Arial"/>
-        </w:rPr>
-      </w:pPr>
-      <w:proofErr w:type="spellStart"/>
-      <w:r>
-        <w:rPr>
-          <w:rFonts w:ascii="Arial" w:hAnsi="Arial" w:cs="Arial"/>
-        </w:rPr>
-        <w:t>df_off_exploded</w:t>
-      </w:r>
-      <w:proofErr w:type="spellEnd"/>
-      <w:r>
-        <w:rPr>
-          <w:rFonts w:ascii="Arial" w:hAnsi="Arial" w:cs="Arial"/>
-        </w:rPr>
-        <w:t xml:space="preserve"> = </w:t>
-      </w:r>
-      <w:proofErr w:type="spellStart"/>
-      <w:r>
-        <w:rPr>
-          <w:rFonts w:ascii="Arial" w:hAnsi="Arial" w:cs="Arial"/>
-        </w:rPr>
-        <w:t>df_</w:t>
-      </w:r>
-      <w:proofErr w:type="gramStart"/>
-      <w:r>
-        <w:rPr>
-          <w:rFonts w:ascii="Arial" w:hAnsi="Arial" w:cs="Arial"/>
-        </w:rPr>
-        <w:t>off.explode</w:t>
-      </w:r>
-      <w:proofErr w:type="spellEnd"/>
-      <w:proofErr w:type="gramEnd"/>
-      <w:r>
-        <w:rPr>
-          <w:rFonts w:ascii="Arial" w:hAnsi="Arial" w:cs="Arial"/>
-        </w:rPr>
-        <w:t>("</w:t>
-      </w:r>
-      <w:proofErr w:type="spellStart"/>
-      <w:r>
-        <w:rPr>
-          <w:rFonts w:ascii="Arial" w:hAnsi="Arial" w:cs="Arial"/>
-        </w:rPr>
-        <w:t>category_updated</w:t>
-      </w:r>
-      <w:proofErr w:type="spellEnd"/>
-      <w:r>
-        <w:rPr>
-          <w:rFonts w:ascii="Arial" w:hAnsi="Arial" w:cs="Arial"/>
-        </w:rPr>
-        <w:t>")</w:t>
-      </w:r>
-    </w:p>
-    <w:p>
-      <w:pPr>
-        <w:rPr>
-          <w:rFonts w:ascii="Arial" w:hAnsi="Arial" w:cs="Arial"/>
-        </w:rPr>
-      </w:pPr>
-      <w:r>
-        <w:rPr>
-          <w:rFonts w:ascii="Arial" w:hAnsi="Arial" w:cs="Arial"/>
-        </w:rPr>
-        <w:t>This process:</w:t>
-      </w:r>
-    </w:p>
-    <w:p>
-      <w:pPr>
-        <w:numPr>
-          <w:ilvl w:val="0"/>
-          <w:numId w:val="31"/>
-        </w:numPr>
-        <w:rPr>
-          <w:rFonts w:ascii="Arial" w:hAnsi="Arial" w:cs="Arial"/>
-        </w:rPr>
-      </w:pPr>
-      <w:proofErr w:type="gramStart"/>
-      <w:r>
-        <w:rPr>
-          <w:rFonts w:ascii="Arial" w:hAnsi="Arial" w:cs="Arial"/>
-        </w:rPr>
-        <w:t>Converts</w:t>
-      </w:r>
-      <w:proofErr w:type="gramEnd"/>
-      <w:r>
-        <w:rPr>
-          <w:rFonts w:ascii="Arial" w:hAnsi="Arial" w:cs="Arial"/>
-        </w:rPr>
-        <w:t xml:space="preserve"> category strings into lists</w:t>
-      </w:r>
-    </w:p>
-    <w:p>
-      <w:pPr>
-        <w:numPr>
-          <w:ilvl w:val="0"/>
-          <w:numId w:val="31"/>
-        </w:numPr>
-        <w:rPr>
-          <w:rFonts w:ascii="Arial" w:hAnsi="Arial" w:cs="Arial"/>
-        </w:rPr>
-      </w:pPr>
-      <w:r>
-        <w:rPr>
-          <w:rFonts w:ascii="Arial" w:hAnsi="Arial" w:cs="Arial"/>
-        </w:rPr>
-        <w:t>Expands each category into a separate row</w:t>
-      </w:r>
-    </w:p>
-    <w:p>
-      <w:pPr>
-        <w:numPr>
-          <w:ilvl w:val="0"/>
-          <w:numId w:val="31"/>
-        </w:numPr>
-        <w:rPr>
-          <w:rFonts w:ascii="Arial" w:hAnsi="Arial" w:cs="Arial"/>
-        </w:rPr>
-      </w:pPr>
-      <w:r>
-        <w:rPr>
-          <w:rFonts w:ascii="Arial" w:hAnsi="Arial" w:cs="Arial"/>
-        </w:rPr>
-        <w:t>Enables accurate frequency analysis of individual categories</w:t>
-      </w:r>
-    </w:p>
-    <w:p>
-      <w:pPr>
-        <w:rPr>
-          <w:rFonts w:ascii="Arial" w:hAnsi="Arial" w:cs="Arial"/>
-          <w:b/>
-          <w:bCs/>
-        </w:rPr>
-      </w:pPr>
-      <w:r>
-        <w:rPr>
-          <w:rFonts w:ascii="Arial" w:hAnsi="Arial" w:cs="Arial"/>
-          <w:b/>
-          <w:bCs/>
-        </w:rPr>
-        <w:t>4.3 Encoding and Font Handling</w:t>
-      </w:r>
-    </w:p>
-    <w:p>
-      <w:pPr>
-        <w:rPr>
-          <w:rFonts w:ascii="Arial" w:hAnsi="Arial" w:cs="Arial"/>
-        </w:rPr>
-      </w:pPr>
-      <w:r>
-        <w:rPr>
-          <w:rFonts w:ascii="Arial" w:hAnsi="Arial" w:cs="Arial"/>
-        </w:rPr>
-        <w:lastRenderedPageBreak/>
-        <w:t>Since the dataset contains Sinhala characters, special attention was given to encoding and visualization:</w:t>
-      </w:r>
-    </w:p>
-    <w:p>
-      <w:pPr>
-        <w:numPr>
-          <w:ilvl w:val="0"/>
-          <w:numId w:val="32"/>
-        </w:numPr>
-        <w:rPr>
-          <w:rFonts w:ascii="Arial" w:hAnsi="Arial" w:cs="Arial"/>
-        </w:rPr>
-      </w:pPr>
-      <w:r>
-        <w:rPr>
-          <w:rFonts w:ascii="Arial" w:hAnsi="Arial" w:cs="Arial"/>
-        </w:rPr>
-        <w:t>UTF-8 encoding was ensured throughout the dataset</w:t>
-      </w:r>
-    </w:p>
-    <w:p>
-      <w:pPr>
-        <w:numPr>
-          <w:ilvl w:val="0"/>
-          <w:numId w:val="32"/>
-        </w:numPr>
-        <w:rPr>
-          <w:rFonts w:ascii="Arial" w:hAnsi="Arial" w:cs="Arial"/>
-        </w:rPr>
-      </w:pPr>
-      <w:r>
-        <w:rPr>
-          <w:rFonts w:ascii="Arial" w:hAnsi="Arial" w:cs="Arial"/>
-        </w:rPr>
-        <w:t>Font issues in visualization libraries were handled to correctly display Sinhala text</w:t>
-      </w:r>
-    </w:p>
-    <w:p>
-      <w:pPr>
-        <w:rPr>
-          <w:rFonts w:ascii="Arial" w:hAnsi="Arial" w:cs="Arial"/>
-          <w:b/>
-          <w:bCs/>
-        </w:rPr>
-      </w:pPr>
-      <w:r>
-        <w:rPr>
-          <w:rFonts w:ascii="Arial" w:hAnsi="Arial" w:cs="Arial"/>
-          <w:b/>
-          <w:bCs/>
-        </w:rPr>
-        <w:t>4.4 Target-Type Assignment</w:t>
-      </w:r>
-    </w:p>
-    <w:p>
-      <w:pPr>
-        <w:rPr>
-          <w:rFonts w:ascii="Arial" w:hAnsi="Arial" w:cs="Arial"/>
-        </w:rPr>
-      </w:pPr>
-      <w:r>
-        <w:rPr>
-          <w:rFonts w:ascii="Arial" w:hAnsi="Arial" w:cs="Arial"/>
-        </w:rPr>
-        <w:t xml:space="preserve">A rule-based approach was used to assign values to the </w:t>
-      </w:r>
-      <w:proofErr w:type="spellStart"/>
-      <w:r>
-        <w:rPr>
-          <w:rFonts w:ascii="Arial" w:hAnsi="Arial" w:cs="Arial"/>
-        </w:rPr>
-        <w:t>target_type</w:t>
-      </w:r>
-      <w:proofErr w:type="spellEnd"/>
-      <w:r>
-        <w:rPr>
-          <w:rFonts w:ascii="Arial" w:hAnsi="Arial" w:cs="Arial"/>
-        </w:rPr>
-        <w:t xml:space="preserve"> column. This involved analyzing the meaning and usage context of each word and mapping it to the appropriate target category.</w:t>
-      </w:r>
-    </w:p>
-    <w:p>
-      <w:pPr>
-        <w:rPr>
-          <w:rFonts w:ascii="Arial" w:hAnsi="Arial" w:cs="Arial"/>
-        </w:rPr>
-      </w:pPr>
-      <w:r>
-        <w:rPr>
-          <w:rFonts w:ascii="Arial" w:hAnsi="Arial" w:cs="Arial"/>
-        </w:rPr>
-        <w:pict w14:anchorId="2BBD51E3">
-          <v:rect id="_x0000_i1209" style="width:0;height:1.5pt" o:hralign="center" o:hrstd="t" o:hr="t" fillcolor="#a0a0a0" stroked="f"/>
+        </w:rPr>
+        <w:pict w14:anchorId="37438204">
+          <v:rect id="_x0000_i1032" style="width:0;height:1.5pt" o:hralign="center" o:hrstd="t" o:hr="t" fillcolor="#a0a0a0" stroked="f"/>
         </w:pict>
       </w:r>
     </w:p>
@@ -1271,7 +2276,8 @@
           <w:b/>
           <w:bCs/>
         </w:rPr>
-        <w:t>5. Methodology</w:t>
+        <w:lastRenderedPageBreak/>
+        <w:t>8. Challenges</w:t>
       </w:r>
     </w:p>
     <w:p>
@@ -1284,45 +2290,39 @@
         <w:rPr>
           <w:rFonts w:ascii="Arial" w:hAnsi="Arial" w:cs="Arial"/>
         </w:rPr>
-        <w:t xml:space="preserve">The methodology adopted in this project is primarily analytical and </w:t>
-      </w:r>
-      <w:proofErr w:type="gramStart"/>
-      <w:r>
-        <w:rPr>
-          <w:rFonts w:ascii="Arial" w:hAnsi="Arial" w:cs="Arial"/>
-        </w:rPr>
-        <w:t>rule-based</w:t>
-      </w:r>
-      <w:proofErr w:type="gramEnd"/>
-      <w:r>
-        <w:rPr>
-          <w:rFonts w:ascii="Arial" w:hAnsi="Arial" w:cs="Arial"/>
-        </w:rPr>
-        <w:t>.</w:t>
+        <w:t>Several challenges were encountered during the project:</w:t>
       </w:r>
     </w:p>
     <w:p>
       <w:pPr>
+        <w:numPr>
+          <w:ilvl w:val="0"/>
+          <w:numId w:val="38"/>
+        </w:numPr>
+        <w:rPr>
+          <w:rFonts w:ascii="Arial" w:hAnsi="Arial" w:cs="Arial"/>
+        </w:rPr>
+      </w:pPr>
+      <w:r>
         <w:rPr>
           <w:rFonts w:ascii="Arial" w:hAnsi="Arial" w:cs="Arial"/>
           <w:b/>
           <w:bCs/>
         </w:rPr>
-      </w:pPr>
+        <w:t>Ambiguity in classification</w:t>
+      </w:r>
       <w:r>
         <w:rPr>
           <w:rFonts w:ascii="Arial" w:hAnsi="Arial" w:cs="Arial"/>
-          <w:b/>
-          <w:bCs/>
-        </w:rPr>
-        <w:t>5.1 Classification Strategy</w:t>
+        </w:rPr>
+        <w:t>: Some words could belong to multiple categories depending on context</w:t>
       </w:r>
     </w:p>
     <w:p>
       <w:pPr>
         <w:numPr>
           <w:ilvl w:val="0"/>
-          <w:numId w:val="33"/>
+          <w:numId w:val="38"/>
         </w:numPr>
         <w:rPr>
           <w:rFonts w:ascii="Arial" w:hAnsi="Arial" w:cs="Arial"/>
@@ -1331,15 +2331,23 @@
       <w:r>
         <w:rPr>
           <w:rFonts w:ascii="Arial" w:hAnsi="Arial" w:cs="Arial"/>
-        </w:rPr>
-        <w:t>Offensive words were categorized based on predefined semantic labels</w:t>
+          <w:b/>
+          <w:bCs/>
+        </w:rPr>
+        <w:t>Limited resources</w:t>
+      </w:r>
+      <w:r>
+        <w:rPr>
+          <w:rFonts w:ascii="Arial" w:hAnsi="Arial" w:cs="Arial"/>
+        </w:rPr>
+        <w:t>: Lack of existing Sinhala NLP tools and annotated datasets</w:t>
       </w:r>
     </w:p>
     <w:p>
       <w:pPr>
         <w:numPr>
           <w:ilvl w:val="0"/>
-          <w:numId w:val="33"/>
+          <w:numId w:val="38"/>
         </w:numPr>
         <w:rPr>
           <w:rFonts w:ascii="Arial" w:hAnsi="Arial" w:cs="Arial"/>
@@ -1348,25 +2356,41 @@
       <w:r>
         <w:rPr>
           <w:rFonts w:ascii="Arial" w:hAnsi="Arial" w:cs="Arial"/>
-        </w:rPr>
-        <w:t>Target types were assigned using linguistic interpretation and contextual understanding</w:t>
+          <w:b/>
+          <w:bCs/>
+        </w:rPr>
+        <w:t>Data complexity</w:t>
+      </w:r>
+      <w:r>
+        <w:rPr>
+          <w:rFonts w:ascii="Arial" w:hAnsi="Arial" w:cs="Arial"/>
+        </w:rPr>
+        <w:t>: Multi-label entries required additional processing</w:t>
       </w:r>
     </w:p>
     <w:p>
       <w:pPr>
+        <w:numPr>
+          <w:ilvl w:val="0"/>
+          <w:numId w:val="38"/>
+        </w:numPr>
+        <w:rPr>
+          <w:rFonts w:ascii="Arial" w:hAnsi="Arial" w:cs="Arial"/>
+        </w:rPr>
+      </w:pPr>
+      <w:r>
         <w:rPr>
           <w:rFonts w:ascii="Arial" w:hAnsi="Arial" w:cs="Arial"/>
           <w:b/>
           <w:bCs/>
         </w:rPr>
-      </w:pPr>
+        <w:t>Technical issues</w:t>
+      </w:r>
       <w:r>
         <w:rPr>
           <w:rFonts w:ascii="Arial" w:hAnsi="Arial" w:cs="Arial"/>
-          <w:b/>
-          <w:bCs/>
-        </w:rPr>
-        <w:t>5.2 Frequency Analysis</w:t>
+        </w:rPr>
+        <w:t>: Encoding and font rendering problems during visualization</w:t>
       </w:r>
     </w:p>
     <w:p>
@@ -1379,280 +2403,8 @@
         <w:rPr>
           <w:rFonts w:ascii="Arial" w:hAnsi="Arial" w:cs="Arial"/>
         </w:rPr>
-        <w:t>Frequency analysis was conducted to understand the distribution of offensive language:</w:t>
-      </w:r>
-    </w:p>
-    <w:p>
-      <w:pPr>
-        <w:rPr>
-          <w:rFonts w:ascii="Arial" w:hAnsi="Arial" w:cs="Arial"/>
-        </w:rPr>
-      </w:pPr>
-      <w:proofErr w:type="spellStart"/>
-      <w:r>
-        <w:rPr>
-          <w:rFonts w:ascii="Arial" w:hAnsi="Arial" w:cs="Arial"/>
-        </w:rPr>
-        <w:t>df_off</w:t>
-      </w:r>
-      <w:proofErr w:type="spellEnd"/>
-      <w:r>
-        <w:rPr>
-          <w:rFonts w:ascii="Arial" w:hAnsi="Arial" w:cs="Arial"/>
-        </w:rPr>
-        <w:t>['</w:t>
-      </w:r>
-      <w:proofErr w:type="spellStart"/>
-      <w:r>
-        <w:rPr>
-          <w:rFonts w:ascii="Arial" w:hAnsi="Arial" w:cs="Arial"/>
-        </w:rPr>
-        <w:t>off_word_count</w:t>
-      </w:r>
-      <w:proofErr w:type="spellEnd"/>
-      <w:r>
-        <w:rPr>
-          <w:rFonts w:ascii="Arial" w:hAnsi="Arial" w:cs="Arial"/>
-        </w:rPr>
-        <w:t>'].</w:t>
-      </w:r>
-      <w:proofErr w:type="spellStart"/>
-      <w:r>
-        <w:rPr>
-          <w:rFonts w:ascii="Arial" w:hAnsi="Arial" w:cs="Arial"/>
-        </w:rPr>
-        <w:t>value_counts</w:t>
-      </w:r>
-      <w:proofErr w:type="spellEnd"/>
-      <w:r>
-        <w:rPr>
-          <w:rFonts w:ascii="Arial" w:hAnsi="Arial" w:cs="Arial"/>
-        </w:rPr>
-        <w:t>(</w:t>
-      </w:r>
-      <w:proofErr w:type="gramStart"/>
-      <w:r>
-        <w:rPr>
-          <w:rFonts w:ascii="Arial" w:hAnsi="Arial" w:cs="Arial"/>
-        </w:rPr>
-        <w:t>).</w:t>
-      </w:r>
-      <w:proofErr w:type="spellStart"/>
-      <w:r>
-        <w:rPr>
-          <w:rFonts w:ascii="Arial" w:hAnsi="Arial" w:cs="Arial"/>
-        </w:rPr>
-        <w:t>sort</w:t>
-      </w:r>
-      <w:proofErr w:type="gramEnd"/>
-      <w:r>
-        <w:rPr>
-          <w:rFonts w:ascii="Arial" w:hAnsi="Arial" w:cs="Arial"/>
-        </w:rPr>
-        <w:t>_</w:t>
-      </w:r>
-      <w:proofErr w:type="gramStart"/>
-      <w:r>
-        <w:rPr>
-          <w:rFonts w:ascii="Arial" w:hAnsi="Arial" w:cs="Arial"/>
-        </w:rPr>
-        <w:t>index</w:t>
-      </w:r>
-      <w:proofErr w:type="spellEnd"/>
-      <w:r>
-        <w:rPr>
-          <w:rFonts w:ascii="Arial" w:hAnsi="Arial" w:cs="Arial"/>
-        </w:rPr>
-        <w:t>(</w:t>
-      </w:r>
-      <w:proofErr w:type="gramEnd"/>
-      <w:r>
-        <w:rPr>
-          <w:rFonts w:ascii="Arial" w:hAnsi="Arial" w:cs="Arial"/>
-        </w:rPr>
-        <w:t>)</w:t>
-      </w:r>
-    </w:p>
-    <w:p>
-      <w:pPr>
-        <w:rPr>
-          <w:rFonts w:ascii="Arial" w:hAnsi="Arial" w:cs="Arial"/>
-        </w:rPr>
-      </w:pPr>
-      <w:r>
-        <w:rPr>
-          <w:rFonts w:ascii="Arial" w:hAnsi="Arial" w:cs="Arial"/>
-        </w:rPr>
-        <w:t>This operation:</w:t>
-      </w:r>
-    </w:p>
-    <w:p>
-      <w:pPr>
-        <w:numPr>
-          <w:ilvl w:val="0"/>
-          <w:numId w:val="34"/>
-        </w:numPr>
-        <w:rPr>
-          <w:rFonts w:ascii="Arial" w:hAnsi="Arial" w:cs="Arial"/>
-        </w:rPr>
-      </w:pPr>
-      <w:r>
-        <w:rPr>
-          <w:rFonts w:ascii="Arial" w:hAnsi="Arial" w:cs="Arial"/>
-        </w:rPr>
-        <w:t xml:space="preserve">Counts the number of occurrences of offensive </w:t>
-      </w:r>
-      <w:proofErr w:type="gramStart"/>
-      <w:r>
-        <w:rPr>
-          <w:rFonts w:ascii="Arial" w:hAnsi="Arial" w:cs="Arial"/>
-        </w:rPr>
-        <w:t>word</w:t>
-      </w:r>
-      <w:proofErr w:type="gramEnd"/>
-      <w:r>
-        <w:rPr>
-          <w:rFonts w:ascii="Arial" w:hAnsi="Arial" w:cs="Arial"/>
-        </w:rPr>
-        <w:t xml:space="preserve"> counts</w:t>
-      </w:r>
-    </w:p>
-    <w:p>
-      <w:pPr>
-        <w:numPr>
-          <w:ilvl w:val="0"/>
-          <w:numId w:val="34"/>
-        </w:numPr>
-        <w:rPr>
-          <w:rFonts w:ascii="Arial" w:hAnsi="Arial" w:cs="Arial"/>
-        </w:rPr>
-      </w:pPr>
-      <w:proofErr w:type="gramStart"/>
-      <w:r>
-        <w:rPr>
-          <w:rFonts w:ascii="Arial" w:hAnsi="Arial" w:cs="Arial"/>
-        </w:rPr>
-        <w:t>Sorts</w:t>
-      </w:r>
-      <w:proofErr w:type="gramEnd"/>
-      <w:r>
-        <w:rPr>
-          <w:rFonts w:ascii="Arial" w:hAnsi="Arial" w:cs="Arial"/>
-        </w:rPr>
-        <w:t xml:space="preserve"> the results in ascending order</w:t>
-      </w:r>
-    </w:p>
-    <w:p>
-      <w:pPr>
-        <w:numPr>
-          <w:ilvl w:val="0"/>
-          <w:numId w:val="34"/>
-        </w:numPr>
-        <w:rPr>
-          <w:rFonts w:ascii="Arial" w:hAnsi="Arial" w:cs="Arial"/>
-        </w:rPr>
-      </w:pPr>
-      <w:r>
-        <w:rPr>
-          <w:rFonts w:ascii="Arial" w:hAnsi="Arial" w:cs="Arial"/>
-        </w:rPr>
-        <w:t>Helps identify common and rare patterns in the dataset</w:t>
-      </w:r>
-    </w:p>
-    <w:p>
-      <w:pPr>
-        <w:rPr>
-          <w:rFonts w:ascii="Arial" w:hAnsi="Arial" w:cs="Arial"/>
-          <w:b/>
-          <w:bCs/>
-        </w:rPr>
-      </w:pPr>
-      <w:r>
-        <w:rPr>
-          <w:rFonts w:ascii="Arial" w:hAnsi="Arial" w:cs="Arial"/>
-          <w:b/>
-          <w:bCs/>
-        </w:rPr>
-        <w:t>5.3 Analytical Approach</w:t>
-      </w:r>
-    </w:p>
-    <w:p>
-      <w:pPr>
-        <w:rPr>
-          <w:rFonts w:ascii="Arial" w:hAnsi="Arial" w:cs="Arial"/>
-        </w:rPr>
-      </w:pPr>
-      <w:r>
-        <w:rPr>
-          <w:rFonts w:ascii="Arial" w:hAnsi="Arial" w:cs="Arial"/>
-        </w:rPr>
-        <w:t>The analysis focused on:</w:t>
-      </w:r>
-    </w:p>
-    <w:p>
-      <w:pPr>
-        <w:numPr>
-          <w:ilvl w:val="0"/>
-          <w:numId w:val="35"/>
-        </w:numPr>
-        <w:rPr>
-          <w:rFonts w:ascii="Arial" w:hAnsi="Arial" w:cs="Arial"/>
-        </w:rPr>
-      </w:pPr>
-      <w:r>
-        <w:rPr>
-          <w:rFonts w:ascii="Arial" w:hAnsi="Arial" w:cs="Arial"/>
-        </w:rPr>
-        <w:t>Category frequency distribution</w:t>
-      </w:r>
-    </w:p>
-    <w:p>
-      <w:pPr>
-        <w:numPr>
-          <w:ilvl w:val="0"/>
-          <w:numId w:val="35"/>
-        </w:numPr>
-        <w:rPr>
-          <w:rFonts w:ascii="Arial" w:hAnsi="Arial" w:cs="Arial"/>
-        </w:rPr>
-      </w:pPr>
-      <w:r>
-        <w:rPr>
-          <w:rFonts w:ascii="Arial" w:hAnsi="Arial" w:cs="Arial"/>
-        </w:rPr>
-        <w:t>Target-type distribution</w:t>
-      </w:r>
-    </w:p>
-    <w:p>
-      <w:pPr>
-        <w:numPr>
-          <w:ilvl w:val="0"/>
-          <w:numId w:val="35"/>
-        </w:numPr>
-        <w:rPr>
-          <w:rFonts w:ascii="Arial" w:hAnsi="Arial" w:cs="Arial"/>
-        </w:rPr>
-      </w:pPr>
-      <w:r>
-        <w:rPr>
-          <w:rFonts w:ascii="Arial" w:hAnsi="Arial" w:cs="Arial"/>
-        </w:rPr>
-        <w:t>Co-occurrence of multiple categories</w:t>
-      </w:r>
-    </w:p>
-    <w:p>
-      <w:pPr>
-        <w:rPr>
-          <w:rFonts w:ascii="Arial" w:hAnsi="Arial" w:cs="Arial"/>
-        </w:rPr>
-      </w:pPr>
-      <w:r>
-        <w:rPr>
-          <w:rFonts w:ascii="Arial" w:hAnsi="Arial" w:cs="Arial"/>
-        </w:rPr>
-        <w:lastRenderedPageBreak/>
-        <w:pict w14:anchorId="18FB38E0">
-          <v:rect id="_x0000_i1210" style="width:0;height:1.5pt" o:hralign="center" o:hrstd="t" o:hr="t" fillcolor="#a0a0a0" stroked="f"/>
+        <w:pict w14:anchorId="33DF9252">
+          <v:rect id="_x0000_i1033" style="width:0;height:1.5pt" o:hralign="center" o:hrstd="t" o:hr="t" fillcolor="#a0a0a0" stroked="f"/>
         </w:pict>
       </w:r>
     </w:p>
@@ -1670,7 +2422,7 @@
           <w:b/>
           <w:bCs/>
         </w:rPr>
-        <w:t>6. Data Analysis and Visualization</w:t>
+        <w:t>9. Conclusion</w:t>
       </w:r>
     </w:p>
     <w:p>
@@ -1683,24 +2435,20 @@
         <w:rPr>
           <w:rFonts w:ascii="Arial" w:hAnsi="Arial" w:cs="Arial"/>
         </w:rPr>
-        <w:t>Exploratory Data Analysis (EDA) was performed to extract meaningful insights.</w:t>
+        <w:t>This project successfully developed and analyzed a structured dataset of Sinhala taboo language. By categorizing offensive words and introducing a target-type classification system, the study provides valuable insights into the nature and distribution of offensive language in Sinhala.</w:t>
       </w:r>
     </w:p>
     <w:p>
       <w:pPr>
         <w:rPr>
           <w:rFonts w:ascii="Arial" w:hAnsi="Arial" w:cs="Arial"/>
-          <w:b/>
-          <w:bCs/>
         </w:rPr>
       </w:pPr>
       <w:r>
         <w:rPr>
           <w:rFonts w:ascii="Arial" w:hAnsi="Arial" w:cs="Arial"/>
-          <w:b/>
-          <w:bCs/>
-        </w:rPr>
-        <w:t>6.1 Category Distribution Analysis</w:t>
+        </w:rPr>
+        <w:t>The findings highlight the importance of considering multiple dimensions—such as category and target—when analyzing harmful language. This work serves as a foundational step toward building automated systems for offensive language detection in low-resource languages.</w:t>
       </w:r>
     </w:p>
     <w:p>
@@ -1713,183 +2461,8 @@
         <w:rPr>
           <w:rFonts w:ascii="Arial" w:hAnsi="Arial" w:cs="Arial"/>
         </w:rPr>
-        <w:t>The frequency of each category was computed to identify dominant types of offensive language. The use of exploded data ensured that multi-category entries were accurately represented.</w:t>
-      </w:r>
-    </w:p>
-    <w:p>
-      <w:pPr>
-        <w:rPr>
-          <w:rFonts w:ascii="Arial" w:hAnsi="Arial" w:cs="Arial"/>
-          <w:b/>
-          <w:bCs/>
-        </w:rPr>
-      </w:pPr>
-      <w:r>
-        <w:rPr>
-          <w:rFonts w:ascii="Arial" w:hAnsi="Arial" w:cs="Arial"/>
-          <w:b/>
-          <w:bCs/>
-        </w:rPr>
-        <w:t>6.2 Target-Type Distribution</w:t>
-      </w:r>
-    </w:p>
-    <w:p>
-      <w:pPr>
-        <w:rPr>
-          <w:rFonts w:ascii="Arial" w:hAnsi="Arial" w:cs="Arial"/>
-        </w:rPr>
-      </w:pPr>
-      <w:r>
-        <w:rPr>
-          <w:rFonts w:ascii="Arial" w:hAnsi="Arial" w:cs="Arial"/>
-        </w:rPr>
-        <w:t>The distribution of target types (IND, GRP, UNT, OTH) was analyzed to understand how offensive language is directed. This provides insight into whether offensive expressions are more personalized or generalized.</w:t>
-      </w:r>
-    </w:p>
-    <w:p>
-      <w:pPr>
-        <w:rPr>
-          <w:rFonts w:ascii="Arial" w:hAnsi="Arial" w:cs="Arial"/>
-          <w:b/>
-          <w:bCs/>
-        </w:rPr>
-      </w:pPr>
-      <w:r>
-        <w:rPr>
-          <w:rFonts w:ascii="Arial" w:hAnsi="Arial" w:cs="Arial"/>
-          <w:b/>
-          <w:bCs/>
-        </w:rPr>
-        <w:t>6.3 Visualization Techniques</w:t>
-      </w:r>
-    </w:p>
-    <w:p>
-      <w:pPr>
-        <w:rPr>
-          <w:rFonts w:ascii="Arial" w:hAnsi="Arial" w:cs="Arial"/>
-        </w:rPr>
-      </w:pPr>
-      <w:r>
-        <w:rPr>
-          <w:rFonts w:ascii="Arial" w:hAnsi="Arial" w:cs="Arial"/>
-        </w:rPr>
-        <w:t>Several visualization techniques were used:</w:t>
-      </w:r>
-    </w:p>
-    <w:p>
-      <w:pPr>
-        <w:numPr>
-          <w:ilvl w:val="0"/>
-          <w:numId w:val="36"/>
-        </w:numPr>
-        <w:rPr>
-          <w:rFonts w:ascii="Arial" w:hAnsi="Arial" w:cs="Arial"/>
-        </w:rPr>
-      </w:pPr>
-      <w:r>
-        <w:rPr>
-          <w:rFonts w:ascii="Arial" w:hAnsi="Arial" w:cs="Arial"/>
-          <w:b/>
-          <w:bCs/>
-        </w:rPr>
-        <w:t>Bar charts</w:t>
-      </w:r>
-      <w:r>
-        <w:rPr>
-          <w:rFonts w:ascii="Arial" w:hAnsi="Arial" w:cs="Arial"/>
-        </w:rPr>
-        <w:t xml:space="preserve"> to display category frequencies</w:t>
-      </w:r>
-    </w:p>
-    <w:p>
-      <w:pPr>
-        <w:numPr>
-          <w:ilvl w:val="0"/>
-          <w:numId w:val="36"/>
-        </w:numPr>
-        <w:rPr>
-          <w:rFonts w:ascii="Arial" w:hAnsi="Arial" w:cs="Arial"/>
-        </w:rPr>
-      </w:pPr>
-      <w:r>
-        <w:rPr>
-          <w:rFonts w:ascii="Arial" w:hAnsi="Arial" w:cs="Arial"/>
-          <w:b/>
-          <w:bCs/>
-        </w:rPr>
-        <w:t>Histograms</w:t>
-      </w:r>
-      <w:r>
-        <w:rPr>
-          <w:rFonts w:ascii="Arial" w:hAnsi="Arial" w:cs="Arial"/>
-        </w:rPr>
-        <w:t xml:space="preserve"> to show distribution of offensive </w:t>
-      </w:r>
-      <w:proofErr w:type="gramStart"/>
-      <w:r>
-        <w:rPr>
-          <w:rFonts w:ascii="Arial" w:hAnsi="Arial" w:cs="Arial"/>
-        </w:rPr>
-        <w:t>word</w:t>
-      </w:r>
-      <w:proofErr w:type="gramEnd"/>
-      <w:r>
-        <w:rPr>
-          <w:rFonts w:ascii="Arial" w:hAnsi="Arial" w:cs="Arial"/>
-        </w:rPr>
-        <w:t xml:space="preserve"> counts</w:t>
-      </w:r>
-    </w:p>
-    <w:p>
-      <w:pPr>
-        <w:numPr>
-          <w:ilvl w:val="0"/>
-          <w:numId w:val="36"/>
-        </w:numPr>
-        <w:rPr>
-          <w:rFonts w:ascii="Arial" w:hAnsi="Arial" w:cs="Arial"/>
-        </w:rPr>
-      </w:pPr>
-      <w:r>
-        <w:rPr>
-          <w:rFonts w:ascii="Arial" w:hAnsi="Arial" w:cs="Arial"/>
-          <w:b/>
-          <w:bCs/>
-        </w:rPr>
-        <w:t>Annotated graphs</w:t>
-      </w:r>
-      <w:r>
-        <w:rPr>
-          <w:rFonts w:ascii="Arial" w:hAnsi="Arial" w:cs="Arial"/>
-        </w:rPr>
-        <w:t xml:space="preserve"> to display exact values for clarity</w:t>
-      </w:r>
-    </w:p>
-    <w:p>
-      <w:pPr>
-        <w:rPr>
-          <w:rFonts w:ascii="Arial" w:hAnsi="Arial" w:cs="Arial"/>
-        </w:rPr>
-      </w:pPr>
-      <w:r>
-        <w:rPr>
-          <w:rFonts w:ascii="Arial" w:hAnsi="Arial" w:cs="Arial"/>
-        </w:rPr>
-        <w:t>Visualization enhances interpretability and helps communicate findings effectively.</w:t>
-      </w:r>
-    </w:p>
-    <w:p>
-      <w:pPr>
-        <w:rPr>
-          <w:rFonts w:ascii="Arial" w:hAnsi="Arial" w:cs="Arial"/>
-        </w:rPr>
-      </w:pPr>
-      <w:r>
-        <w:rPr>
-          <w:rFonts w:ascii="Arial" w:hAnsi="Arial" w:cs="Arial"/>
-        </w:rPr>
-        <w:pict w14:anchorId="78C1A0D2">
-          <v:rect id="_x0000_i1211" style="width:0;height:1.5pt" o:hralign="center" o:hrstd="t" o:hr="t" fillcolor="#a0a0a0" stroked="f"/>
+        <w:pict w14:anchorId="22FD167A">
+          <v:rect id="_x0000_i1034" style="width:0;height:1.5pt" o:hralign="center" o:hrstd="t" o:hr="t" fillcolor="#a0a0a0" stroked="f"/>
         </w:pict>
       </w:r>
     </w:p>
@@ -1907,416 +2480,6 @@
           <w:b/>
           <w:bCs/>
         </w:rPr>
-        <w:t>7. Results and Findings</w:t>
-      </w:r>
-    </w:p>
-    <w:p>
-      <w:pPr>
-        <w:rPr>
-          <w:rFonts w:ascii="Arial" w:hAnsi="Arial" w:cs="Arial"/>
-        </w:rPr>
-      </w:pPr>
-      <w:r>
-        <w:rPr>
-          <w:rFonts w:ascii="Arial" w:hAnsi="Arial" w:cs="Arial"/>
-        </w:rPr>
-        <w:t>The analysis produced several important findings:</w:t>
-      </w:r>
-    </w:p>
-    <w:p>
-      <w:pPr>
-        <w:numPr>
-          <w:ilvl w:val="0"/>
-          <w:numId w:val="37"/>
-        </w:numPr>
-        <w:rPr>
-          <w:rFonts w:ascii="Arial" w:hAnsi="Arial" w:cs="Arial"/>
-        </w:rPr>
-      </w:pPr>
-      <w:r>
-        <w:rPr>
-          <w:rFonts w:ascii="Arial" w:hAnsi="Arial" w:cs="Arial"/>
-          <w:b/>
-          <w:bCs/>
-        </w:rPr>
-        <w:t>Gender-related offensive language</w:t>
-      </w:r>
-      <w:r>
-        <w:rPr>
-          <w:rFonts w:ascii="Arial" w:hAnsi="Arial" w:cs="Arial"/>
-        </w:rPr>
-        <w:t xml:space="preserve"> was the most frequent category, indicating a strong presence of gender-based insults</w:t>
-      </w:r>
-    </w:p>
-    <w:p>
-      <w:pPr>
-        <w:numPr>
-          <w:ilvl w:val="0"/>
-          <w:numId w:val="37"/>
-        </w:numPr>
-        <w:rPr>
-          <w:rFonts w:ascii="Arial" w:hAnsi="Arial" w:cs="Arial"/>
-        </w:rPr>
-      </w:pPr>
-      <w:r>
-        <w:rPr>
-          <w:rFonts w:ascii="Arial" w:hAnsi="Arial" w:cs="Arial"/>
-        </w:rPr>
-        <w:t xml:space="preserve">A significant number of entries contained </w:t>
-      </w:r>
-      <w:r>
-        <w:rPr>
-          <w:rFonts w:ascii="Arial" w:hAnsi="Arial" w:cs="Arial"/>
-          <w:b/>
-          <w:bCs/>
-        </w:rPr>
-        <w:t>multiple categories</w:t>
-      </w:r>
-      <w:r>
-        <w:rPr>
-          <w:rFonts w:ascii="Arial" w:hAnsi="Arial" w:cs="Arial"/>
-        </w:rPr>
-        <w:t>, highlighting overlapping forms of discrimination</w:t>
-      </w:r>
-    </w:p>
-    <w:p>
-      <w:pPr>
-        <w:numPr>
-          <w:ilvl w:val="0"/>
-          <w:numId w:val="37"/>
-        </w:numPr>
-        <w:rPr>
-          <w:rFonts w:ascii="Arial" w:hAnsi="Arial" w:cs="Arial"/>
-        </w:rPr>
-      </w:pPr>
-      <w:proofErr w:type="gramStart"/>
-      <w:r>
-        <w:rPr>
-          <w:rFonts w:ascii="Arial" w:hAnsi="Arial" w:cs="Arial"/>
-        </w:rPr>
-        <w:t>The majority of</w:t>
-      </w:r>
-      <w:proofErr w:type="gramEnd"/>
-      <w:r>
-        <w:rPr>
-          <w:rFonts w:ascii="Arial" w:hAnsi="Arial" w:cs="Arial"/>
-        </w:rPr>
-        <w:t xml:space="preserve"> offensive expressions were directed toward </w:t>
-      </w:r>
-      <w:r>
-        <w:rPr>
-          <w:rFonts w:ascii="Arial" w:hAnsi="Arial" w:cs="Arial"/>
-          <w:b/>
-          <w:bCs/>
-        </w:rPr>
-        <w:t>individuals (IND)</w:t>
-      </w:r>
-      <w:r>
-        <w:rPr>
-          <w:rFonts w:ascii="Arial" w:hAnsi="Arial" w:cs="Arial"/>
-        </w:rPr>
-        <w:t xml:space="preserve"> and </w:t>
-      </w:r>
-      <w:r>
-        <w:rPr>
-          <w:rFonts w:ascii="Arial" w:hAnsi="Arial" w:cs="Arial"/>
-          <w:b/>
-          <w:bCs/>
-        </w:rPr>
-        <w:t>groups (GRP)</w:t>
-      </w:r>
-    </w:p>
-    <w:p>
-      <w:pPr>
-        <w:numPr>
-          <w:ilvl w:val="0"/>
-          <w:numId w:val="37"/>
-        </w:numPr>
-        <w:rPr>
-          <w:rFonts w:ascii="Arial" w:hAnsi="Arial" w:cs="Arial"/>
-        </w:rPr>
-      </w:pPr>
-      <w:r>
-        <w:rPr>
-          <w:rFonts w:ascii="Arial" w:hAnsi="Arial" w:cs="Arial"/>
-        </w:rPr>
-        <w:t>The dataset showed a balanced distribution of offensiveness levels, with a concentration in the medium category</w:t>
-      </w:r>
-    </w:p>
-    <w:p>
-      <w:pPr>
-        <w:rPr>
-          <w:rFonts w:ascii="Arial" w:hAnsi="Arial" w:cs="Arial"/>
-        </w:rPr>
-      </w:pPr>
-      <w:r>
-        <w:rPr>
-          <w:rFonts w:ascii="Arial" w:hAnsi="Arial" w:cs="Arial"/>
-        </w:rPr>
-        <w:t xml:space="preserve">These findings demonstrate that offensive language is complex, multi-dimensional, and often </w:t>
-      </w:r>
-      <w:proofErr w:type="gramStart"/>
-      <w:r>
-        <w:rPr>
-          <w:rFonts w:ascii="Arial" w:hAnsi="Arial" w:cs="Arial"/>
-        </w:rPr>
-        <w:t>context-dependent</w:t>
-      </w:r>
-      <w:proofErr w:type="gramEnd"/>
-      <w:r>
-        <w:rPr>
-          <w:rFonts w:ascii="Arial" w:hAnsi="Arial" w:cs="Arial"/>
-        </w:rPr>
-        <w:t>.</w:t>
-      </w:r>
-    </w:p>
-    <w:p>
-      <w:pPr>
-        <w:rPr>
-          <w:rFonts w:ascii="Arial" w:hAnsi="Arial" w:cs="Arial"/>
-        </w:rPr>
-      </w:pPr>
-      <w:r>
-        <w:rPr>
-          <w:rFonts w:ascii="Arial" w:hAnsi="Arial" w:cs="Arial"/>
-        </w:rPr>
-        <w:lastRenderedPageBreak/>
-        <w:pict w14:anchorId="37438204">
-          <v:rect id="_x0000_i1212" style="width:0;height:1.5pt" o:hralign="center" o:hrstd="t" o:hr="t" fillcolor="#a0a0a0" stroked="f"/>
-        </w:pict>
-      </w:r>
-    </w:p>
-    <w:p>
-      <w:pPr>
-        <w:rPr>
-          <w:rFonts w:ascii="Arial" w:hAnsi="Arial" w:cs="Arial"/>
-          <w:b/>
-          <w:bCs/>
-        </w:rPr>
-      </w:pPr>
-      <w:r>
-        <w:rPr>
-          <w:rFonts w:ascii="Arial" w:hAnsi="Arial" w:cs="Arial"/>
-          <w:b/>
-          <w:bCs/>
-        </w:rPr>
-        <w:t>8. Challenges</w:t>
-      </w:r>
-    </w:p>
-    <w:p>
-      <w:pPr>
-        <w:rPr>
-          <w:rFonts w:ascii="Arial" w:hAnsi="Arial" w:cs="Arial"/>
-        </w:rPr>
-      </w:pPr>
-      <w:r>
-        <w:rPr>
-          <w:rFonts w:ascii="Arial" w:hAnsi="Arial" w:cs="Arial"/>
-        </w:rPr>
-        <w:t>Several challenges were encountered during the project:</w:t>
-      </w:r>
-    </w:p>
-    <w:p>
-      <w:pPr>
-        <w:numPr>
-          <w:ilvl w:val="0"/>
-          <w:numId w:val="38"/>
-        </w:numPr>
-        <w:rPr>
-          <w:rFonts w:ascii="Arial" w:hAnsi="Arial" w:cs="Arial"/>
-        </w:rPr>
-      </w:pPr>
-      <w:r>
-        <w:rPr>
-          <w:rFonts w:ascii="Arial" w:hAnsi="Arial" w:cs="Arial"/>
-          <w:b/>
-          <w:bCs/>
-        </w:rPr>
-        <w:t>Ambiguity in classification</w:t>
-      </w:r>
-      <w:r>
-        <w:rPr>
-          <w:rFonts w:ascii="Arial" w:hAnsi="Arial" w:cs="Arial"/>
-        </w:rPr>
-        <w:t>: Some words could belong to multiple categories depending on context</w:t>
-      </w:r>
-    </w:p>
-    <w:p>
-      <w:pPr>
-        <w:numPr>
-          <w:ilvl w:val="0"/>
-          <w:numId w:val="38"/>
-        </w:numPr>
-        <w:rPr>
-          <w:rFonts w:ascii="Arial" w:hAnsi="Arial" w:cs="Arial"/>
-        </w:rPr>
-      </w:pPr>
-      <w:r>
-        <w:rPr>
-          <w:rFonts w:ascii="Arial" w:hAnsi="Arial" w:cs="Arial"/>
-          <w:b/>
-          <w:bCs/>
-        </w:rPr>
-        <w:t>Limited resources</w:t>
-      </w:r>
-      <w:r>
-        <w:rPr>
-          <w:rFonts w:ascii="Arial" w:hAnsi="Arial" w:cs="Arial"/>
-        </w:rPr>
-        <w:t>: Lack of existing Sinhala NLP tools and annotated datasets</w:t>
-      </w:r>
-    </w:p>
-    <w:p>
-      <w:pPr>
-        <w:numPr>
-          <w:ilvl w:val="0"/>
-          <w:numId w:val="38"/>
-        </w:numPr>
-        <w:rPr>
-          <w:rFonts w:ascii="Arial" w:hAnsi="Arial" w:cs="Arial"/>
-        </w:rPr>
-      </w:pPr>
-      <w:r>
-        <w:rPr>
-          <w:rFonts w:ascii="Arial" w:hAnsi="Arial" w:cs="Arial"/>
-          <w:b/>
-          <w:bCs/>
-        </w:rPr>
-        <w:t>Data complexity</w:t>
-      </w:r>
-      <w:r>
-        <w:rPr>
-          <w:rFonts w:ascii="Arial" w:hAnsi="Arial" w:cs="Arial"/>
-        </w:rPr>
-        <w:t>: Multi-label entries required additional processing</w:t>
-      </w:r>
-    </w:p>
-    <w:p>
-      <w:pPr>
-        <w:numPr>
-          <w:ilvl w:val="0"/>
-          <w:numId w:val="38"/>
-        </w:numPr>
-        <w:rPr>
-          <w:rFonts w:ascii="Arial" w:hAnsi="Arial" w:cs="Arial"/>
-        </w:rPr>
-      </w:pPr>
-      <w:r>
-        <w:rPr>
-          <w:rFonts w:ascii="Arial" w:hAnsi="Arial" w:cs="Arial"/>
-          <w:b/>
-          <w:bCs/>
-        </w:rPr>
-        <w:t>Technical issues</w:t>
-      </w:r>
-      <w:r>
-        <w:rPr>
-          <w:rFonts w:ascii="Arial" w:hAnsi="Arial" w:cs="Arial"/>
-        </w:rPr>
-        <w:t>: Encoding and font rendering problems during visualization</w:t>
-      </w:r>
-    </w:p>
-    <w:p>
-      <w:pPr>
-        <w:rPr>
-          <w:rFonts w:ascii="Arial" w:hAnsi="Arial" w:cs="Arial"/>
-        </w:rPr>
-      </w:pPr>
-      <w:r>
-        <w:rPr>
-          <w:rFonts w:ascii="Arial" w:hAnsi="Arial" w:cs="Arial"/>
-        </w:rPr>
-        <w:pict w14:anchorId="33DF9252">
-          <v:rect id="_x0000_i1213" style="width:0;height:1.5pt" o:hralign="center" o:hrstd="t" o:hr="t" fillcolor="#a0a0a0" stroked="f"/>
-        </w:pict>
-      </w:r>
-    </w:p>
-    <w:p>
-      <w:pPr>
-        <w:rPr>
-          <w:rFonts w:ascii="Arial" w:hAnsi="Arial" w:cs="Arial"/>
-          <w:b/>
-          <w:bCs/>
-        </w:rPr>
-      </w:pPr>
-      <w:r>
-        <w:rPr>
-          <w:rFonts w:ascii="Arial" w:hAnsi="Arial" w:cs="Arial"/>
-          <w:b/>
-          <w:bCs/>
-        </w:rPr>
-        <w:t>9. Conclusion</w:t>
-      </w:r>
-    </w:p>
-    <w:p>
-      <w:pPr>
-        <w:rPr>
-          <w:rFonts w:ascii="Arial" w:hAnsi="Arial" w:cs="Arial"/>
-        </w:rPr>
-      </w:pPr>
-      <w:r>
-        <w:rPr>
-          <w:rFonts w:ascii="Arial" w:hAnsi="Arial" w:cs="Arial"/>
-        </w:rPr>
-        <w:t xml:space="preserve">This project successfully developed and analyzed a structured dataset of Sinhala </w:t>
-      </w:r>
-      <w:proofErr w:type="gramStart"/>
-      <w:r>
-        <w:rPr>
-          <w:rFonts w:ascii="Arial" w:hAnsi="Arial" w:cs="Arial"/>
-        </w:rPr>
-        <w:t>taboo language</w:t>
-      </w:r>
-      <w:proofErr w:type="gramEnd"/>
-      <w:r>
-        <w:rPr>
-          <w:rFonts w:ascii="Arial" w:hAnsi="Arial" w:cs="Arial"/>
-        </w:rPr>
-        <w:t>. By categorizing offensive words and introducing a target-type classification system, the study provides valuable insights into the nature and distribution of offensive language in Sinhala.</w:t>
-      </w:r>
-    </w:p>
-    <w:p>
-      <w:pPr>
-        <w:rPr>
-          <w:rFonts w:ascii="Arial" w:hAnsi="Arial" w:cs="Arial"/>
-        </w:rPr>
-      </w:pPr>
-      <w:r>
-        <w:rPr>
-          <w:rFonts w:ascii="Arial" w:hAnsi="Arial" w:cs="Arial"/>
-        </w:rPr>
-        <w:t>The findings highlight the importance of considering multiple dimensions—such as category and target—when analyzing harmful language. This work serves as a foundational step toward building automated systems for offensive language detection in low-resource languages.</w:t>
-      </w:r>
-    </w:p>
-    <w:p>
-      <w:pPr>
-        <w:rPr>
-          <w:rFonts w:ascii="Arial" w:hAnsi="Arial" w:cs="Arial"/>
-        </w:rPr>
-      </w:pPr>
-      <w:r>
-        <w:rPr>
-          <w:rFonts w:ascii="Arial" w:hAnsi="Arial" w:cs="Arial"/>
-        </w:rPr>
-        <w:pict w14:anchorId="22FD167A">
-          <v:rect id="_x0000_i1214" style="width:0;height:1.5pt" o:hralign="center" o:hrstd="t" o:hr="t" fillcolor="#a0a0a0" stroked="f"/>
-        </w:pict>
-      </w:r>
-    </w:p>
-    <w:p>
-      <w:pPr>
-        <w:rPr>
-          <w:rFonts w:ascii="Arial" w:hAnsi="Arial" w:cs="Arial"/>
-          <w:b/>
-          <w:bCs/>
-        </w:rPr>
-      </w:pPr>
-      <w:r>
-        <w:rPr>
-          <w:rFonts w:ascii="Arial" w:hAnsi="Arial" w:cs="Arial"/>
-          <w:b/>
-          <w:bCs/>
-        </w:rPr>
         <w:t>10. Future Work</w:t>
       </w:r>
     </w:p>
@@ -2432,14 +2595,6 @@
           <w:rFonts w:ascii="Arial" w:hAnsi="Arial" w:cs="Arial"/>
         </w:rPr>
       </w:pPr>
-      <w:r>
-        <w:rPr>
-          <w:rFonts w:ascii="Arial" w:hAnsi="Arial" w:cs="Arial"/>
-        </w:rPr>
-        <w:pict w14:anchorId="6254131F">
-          <v:rect id="_x0000_i1215" style="width:0;height:1.5pt" o:hralign="center" o:hrstd="t" o:hr="t" fillcolor="#a0a0a0" stroked="f"/>
-        </w:pict>
-      </w:r>
     </w:p>
     <w:p>
       <w:pPr>
@@ -2489,7 +2644,6 @@
         <w:rPr>
           <w:rFonts w:ascii="Arial" w:hAnsi="Arial" w:cs="Arial"/>
         </w:rPr>
-        <w:lastRenderedPageBreak/>
         <w:t>NLP research on low-resource languages</w:t>
       </w:r>
     </w:p>
@@ -2507,6 +2661,7 @@
         <w:rPr>
           <w:rFonts w:ascii="Arial" w:hAnsi="Arial" w:cs="Arial"/>
         </w:rPr>
+        <w:lastRenderedPageBreak/>
         <w:t>Python libraries such as Pandas and Matplotlib</w:t>
       </w:r>
     </w:p>
@@ -2516,14 +2671,6 @@
           <w:rFonts w:ascii="Arial" w:hAnsi="Arial" w:cs="Arial"/>
         </w:rPr>
       </w:pPr>
-      <w:r>
-        <w:rPr>
-          <w:rFonts w:ascii="Arial" w:hAnsi="Arial" w:cs="Arial"/>
-        </w:rPr>
-        <w:pict w14:anchorId="4E6E6D12">
-          <v:rect id="_x0000_i1216" style="width:0;height:1.5pt" o:hralign="center" o:hrstd="t" o:hr="t" fillcolor="#a0a0a0" stroked="f"/>
-        </w:pict>
-      </w:r>
     </w:p>
     <w:p>
       <w:pPr>
@@ -8849,7 +8996,6 @@
     <w:basedOn w:val="Normal"/>
     <w:next w:val="Normal"/>
     <w:uiPriority w:val="35"/>
-    <w:semiHidden/>
     <w:unhideWhenUsed/>
     <w:qFormat/>
     <w:rsid w:val="00FC693F"/>

</xml_diff>